<commit_message>
chore(template): finalize modify-certificate blueprint baseline
</commit_message>
<xml_diff>
--- a/backend/templates/修改证书蓝本.docx
+++ b/backend/templates/修改证书蓝本.docx
@@ -4357,7 +4357,7 @@
                 <ns0:sz ns0:val="24"/>
                 <ns0:szCs ns0:val="24"/>
               </ns0:rPr>
-              <ns0:t>JB/T 4279.6-2008</ns0:t>
+              <ns0:t> </ns0:t>
             </ns0:r>
             <ns0:r ns0:rsidRPr="00BC5E59">
               <ns0:rPr>
@@ -4367,7 +4367,7 @@
                 <ns0:szCs ns0:val="24"/>
                 <ns0:lang ns0:val="zh-CN"/>
               </ns0:rPr>
-              <ns0:t>《</ns0:t>
+              <ns0:t/>
             </ns0:r>
             <ns0:r ns0:rsidRPr="00BC5E59">
               <ns0:rPr>
@@ -4377,7 +4377,7 @@
                 <ns0:szCs ns0:val="24"/>
                 <ns0:lang ns0:val="zh-CN"/>
               </ns0:rPr>
-              <ns0:t>漆包绕组线试验仪器设备检定方法</ns0:t>
+              <ns0:t/>
             </ns0:r>
             <ns0:r ns0:rsidRPr="00BC5E59">
               <ns0:rPr>
@@ -4387,7 +4387,7 @@
                 <ns0:szCs ns0:val="24"/>
                 <ns0:lang ns0:val="zh-CN"/>
               </ns0:rPr>
-              <ns0:t xml:space="preserve">  </ns0:t>
+              <ns0:t xml:space="preserve"/>
             </ns0:r>
             <ns0:r ns0:rsidRPr="00BC5E59">
               <ns0:rPr>
@@ -4397,7 +4397,7 @@
                 <ns0:szCs ns0:val="24"/>
                 <ns0:lang ns0:val="zh-CN"/>
               </ns0:rPr>
-              <ns0:t>第</ns0:t>
+              <ns0:t/>
             </ns0:r>
             <ns0:r ns0:rsidRPr="00BC5E59">
               <ns0:rPr>
@@ -4407,7 +4407,7 @@
                 <ns0:szCs ns0:val="24"/>
                 <ns0:lang ns0:val="zh-CN"/>
               </ns0:rPr>
-              <ns0:t>6</ns0:t>
+              <ns0:t/>
             </ns0:r>
             <ns0:r ns0:rsidRPr="00BC5E59">
               <ns0:rPr>
@@ -4417,7 +4417,7 @@
                 <ns0:szCs ns0:val="24"/>
                 <ns0:lang ns0:val="zh-CN"/>
               </ns0:rPr>
-              <ns0:t>部分：剥离试验仪</ns0:t>
+              <ns0:t/>
             </ns0:r>
             <ns0:r ns0:rsidRPr="00BC5E59">
               <ns0:rPr>
@@ -4427,199 +4427,7 @@
                 <ns0:szCs ns0:val="24"/>
                 <ns0:lang ns0:val="zh-CN"/>
               </ns0:rPr>
-              <ns0:t>》</ns0:t>
-            </ns0:r>
-          </ns0:p>
-        </ns0:tc>
-      </ns0:tr>
-      <ns0:tr ns0:rsidR="00A81D9F" ns0:rsidTr="00D02B30">
-        <ns0:trPr>
-          <ns0:trHeight ns0:val="567"/>
-          <ns0:jc ns0:val="center"/>
-        </ns0:trPr>
-        <ns0:tc>
-          <ns0:tcPr>
-            <ns0:tcW ns0:w="498" ns0:type="dxa"/>
-            <ns0:tcBorders>
-              <ns0:top ns0:val="nil"/>
-            </ns0:tcBorders>
-          </ns0:tcPr>
-          <ns0:p ns0:rsidR="00A81D9F" ns0:rsidRDefault="00A81D9F" ns0:rsidP="00345F9F">
-            <ns0:pPr>
-              <ns0:autoSpaceDE ns0:val="0"/>
-              <ns0:autoSpaceDN ns0:val="0"/>
-              <ns0:adjustRightInd ns0:val="0"/>
-              <ns0:rPr>
-                <ns0:rFonts ns0:ascii="Times New Roman" ns0:eastAsia="宋体" ns0:hAnsi="Times New Roman"/>
-                <ns0:sz ns0:val="24"/>
-                <ns0:szCs ns0:val="24"/>
-              </ns0:rPr>
-            </ns0:pPr>
-          </ns0:p>
-        </ns0:tc>
-        <ns0:tc>
-          <ns0:tcPr>
-            <ns0:tcW ns0:w="10162" ns0:type="dxa"/>
-            <ns0:gridSpan ns0:val="20"/>
-            <ns0:tcBorders>
-              <ns0:top ns0:val="nil"/>
-            </ns0:tcBorders>
-          </ns0:tcPr>
-          <ns0:p ns0:rsidR="00A81D9F" ns0:rsidRPr="00A81D9F" ns0:rsidRDefault="00A81D9F" ns0:rsidP="00A81D9F">
-            <ns0:pPr>
-              <ns0:autoSpaceDE ns0:val="0"/>
-              <ns0:autoSpaceDN ns0:val="0"/>
-              <ns0:adjustRightInd ns0:val="0"/>
-              <ns0:spacing ns0:line="360" ns0:lineRule="auto"/>
-              <ns0:rPr>
-                <ns0:rFonts ns0:ascii="宋体" ns0:eastAsia="宋体" ns0:hAnsi="宋体"/>
-                <ns0:sz ns0:val="24"/>
-                <ns0:szCs ns0:val="24"/>
-              </ns0:rPr>
-            </ns0:pPr>
-            <ns0:r ns0:rsidRPr="00A81D9F">
-              <ns0:rPr>
-                <ns0:rFonts ns0:ascii="宋体" ns0:eastAsia="宋体" ns0:hAnsi="宋体"/>
-                <ns0:sz ns0:val="24"/>
-                <ns0:szCs ns0:val="24"/>
-              </ns0:rPr>
-              <ns0:t>GB/T 4909.7-2009</ns0:t>
-            </ns0:r>
-            <ns0:r ns0:rsidRPr="00A81D9F">
-              <ns0:rPr>
-                <ns0:rFonts ns0:ascii="宋体" ns0:eastAsia="宋体" ns0:hAnsi="宋体" ns0:hint="eastAsia"/>
-                <ns0:sz ns0:val="24"/>
-                <ns0:szCs ns0:val="24"/>
-              </ns0:rPr>
-              <ns0:t>《裸电线试验方法</ns0:t>
-            </ns0:r>
-            <ns0:r ns0:rsidRPr="00A81D9F">
-              <ns0:rPr>
-                <ns0:rFonts ns0:ascii="宋体" ns0:eastAsia="宋体" ns0:hAnsi="宋体"/>
-                <ns0:sz ns0:val="24"/>
-                <ns0:szCs ns0:val="24"/>
-              </ns0:rPr>
-              <ns0:t xml:space="preserve"> </ns0:t>
-            </ns0:r>
-            <ns0:r ns0:rsidRPr="00A81D9F">
-              <ns0:rPr>
-                <ns0:rFonts ns0:ascii="宋体" ns0:eastAsia="宋体" ns0:hAnsi="宋体" ns0:hint="eastAsia"/>
-                <ns0:sz ns0:val="24"/>
-                <ns0:szCs ns0:val="24"/>
-              </ns0:rPr>
-              <ns0:t>第</ns0:t>
-            </ns0:r>
-            <ns0:r ns0:rsidRPr="00A81D9F">
-              <ns0:rPr>
-                <ns0:rFonts ns0:ascii="宋体" ns0:eastAsia="宋体" ns0:hAnsi="宋体"/>
-                <ns0:sz ns0:val="24"/>
-                <ns0:szCs ns0:val="24"/>
-              </ns0:rPr>
-              <ns0:t>7</ns0:t>
-            </ns0:r>
-            <ns0:r ns0:rsidRPr="00A81D9F">
-              <ns0:rPr>
-                <ns0:rFonts ns0:ascii="宋体" ns0:eastAsia="宋体" ns0:hAnsi="宋体" ns0:hint="eastAsia"/>
-                <ns0:sz ns0:val="24"/>
-                <ns0:szCs ns0:val="24"/>
-              </ns0:rPr>
-              <ns0:t>部分：卷绕试验》标准中对试验设备的要求。</ns0:t>
-            </ns0:r>
-          </ns0:p>
-        </ns0:tc>
-      </ns0:tr>
-      <ns0:tr ns0:rsidR="00345F9F" ns0:rsidTr="00D02B30">
-        <ns0:trPr>
-          <ns0:trHeight ns0:val="567"/>
-          <ns0:jc ns0:val="center"/>
-        </ns0:trPr>
-        <ns0:tc>
-          <ns0:tcPr>
-            <ns0:tcW ns0:w="498" ns0:type="dxa"/>
-            <ns0:tcBorders>
-              <ns0:bottom ns0:val="single" ns0:sz="4" ns0:space="0" ns0:color="auto"/>
-            </ns0:tcBorders>
-          </ns0:tcPr>
-          <ns0:p ns0:rsidR="00345F9F" ns0:rsidRDefault="00345F9F" ns0:rsidP="00345F9F">
-            <ns0:pPr>
-              <ns0:autoSpaceDE ns0:val="0"/>
-              <ns0:autoSpaceDN ns0:val="0"/>
-              <ns0:adjustRightInd ns0:val="0"/>
-              <ns0:rPr>
-                <ns0:rFonts ns0:ascii="Times New Roman" ns0:eastAsia="宋体" ns0:hAnsi="Times New Roman"/>
-                <ns0:sz ns0:val="24"/>
-                <ns0:szCs ns0:val="24"/>
-              </ns0:rPr>
-            </ns0:pPr>
-          </ns0:p>
-        </ns0:tc>
-        <ns0:tc>
-          <ns0:tcPr>
-            <ns0:tcW ns0:w="10162" ns0:type="dxa"/>
-            <ns0:gridSpan ns0:val="20"/>
-            <ns0:tcBorders>
-              <ns0:bottom ns0:val="single" ns0:sz="4" ns0:space="0" ns0:color="auto"/>
-            </ns0:tcBorders>
-          </ns0:tcPr>
-          <ns0:p ns0:rsidR="00345F9F" ns0:rsidRPr="00BC5E59" ns0:rsidRDefault="00A81D9F" ns0:rsidP="00345F9F">
-            <ns0:pPr>
-              <ns0:autoSpaceDE ns0:val="0"/>
-              <ns0:autoSpaceDN ns0:val="0"/>
-              <ns0:adjustRightInd ns0:val="0"/>
-              <ns0:spacing ns0:line="360" ns0:lineRule="auto"/>
-              <ns0:rPr>
-                <ns0:rFonts ns0:ascii="宋体" ns0:eastAsia="宋体" ns0:hAnsi="宋体"/>
-                <ns0:sz ns0:val="24"/>
-                <ns0:szCs ns0:val="24"/>
-              </ns0:rPr>
-            </ns0:pPr>
-            <ns0:r ns0:rsidRPr="00A81D9F">
-              <ns0:rPr>
-                <ns0:rFonts ns0:ascii="宋体" ns0:eastAsia="宋体" ns0:hAnsi="宋体"/>
-                <ns0:sz ns0:val="24"/>
-                <ns0:szCs ns0:val="24"/>
-              </ns0:rPr>
-              <ns0:t>GB/T 4909.4-2009</ns0:t>
-            </ns0:r>
-            <ns0:r ns0:rsidRPr="00A81D9F">
-              <ns0:rPr>
-                <ns0:rFonts ns0:ascii="宋体" ns0:eastAsia="宋体" ns0:hAnsi="宋体" ns0:hint="eastAsia"/>
-                <ns0:sz ns0:val="24"/>
-                <ns0:szCs ns0:val="24"/>
-              </ns0:rPr>
-              <ns0:t>《裸电线试验方法</ns0:t>
-            </ns0:r>
-            <ns0:r ns0:rsidRPr="00A81D9F">
-              <ns0:rPr>
-                <ns0:rFonts ns0:ascii="宋体" ns0:eastAsia="宋体" ns0:hAnsi="宋体"/>
-                <ns0:sz ns0:val="24"/>
-                <ns0:szCs ns0:val="24"/>
-              </ns0:rPr>
-              <ns0:t xml:space="preserve"> </ns0:t>
-            </ns0:r>
-            <ns0:r ns0:rsidRPr="00A81D9F">
-              <ns0:rPr>
-                <ns0:rFonts ns0:ascii="宋体" ns0:eastAsia="宋体" ns0:hAnsi="宋体" ns0:hint="eastAsia"/>
-                <ns0:sz ns0:val="24"/>
-                <ns0:szCs ns0:val="24"/>
-              </ns0:rPr>
-              <ns0:t>第</ns0:t>
-            </ns0:r>
-            <ns0:r ns0:rsidRPr="00A81D9F">
-              <ns0:rPr>
-                <ns0:rFonts ns0:ascii="宋体" ns0:eastAsia="宋体" ns0:hAnsi="宋体"/>
-                <ns0:sz ns0:val="24"/>
-                <ns0:szCs ns0:val="24"/>
-              </ns0:rPr>
-              <ns0:t>4</ns0:t>
-            </ns0:r>
-            <ns0:r ns0:rsidRPr="00A81D9F">
-              <ns0:rPr>
-                <ns0:rFonts ns0:ascii="宋体" ns0:eastAsia="宋体" ns0:hAnsi="宋体" ns0:hint="eastAsia"/>
-                <ns0:sz ns0:val="24"/>
-                <ns0:szCs ns0:val="24"/>
-              </ns0:rPr>
-              <ns0:t>部分：扭转试验》</ns0:t>
+              <ns0:t/>
             </ns0:r>
           </ns0:p>
         </ns0:tc>
@@ -5261,7 +5069,7 @@
                 <ns0:sz ns0:val="18"/>
                 <ns0:szCs ns0:val="18"/>
               </ns0:rPr>
-              <ns0:t>钢直尺</ns0:t>
+              <ns0:t> </ns0:t>
             </ns0:r>
           </ns0:p>
         </ns0:tc>
@@ -5297,7 +5105,7 @@
                 <ns0:sz ns0:val="18"/>
                 <ns0:szCs ns0:val="18"/>
               </ns0:rPr>
-              <ns0:t xml:space="preserve">       </ns0:t>
+              <ns0:t xml:space="preserve"> </ns0:t>
             </ns0:r>
             <ns0:r>
               <ns0:rPr>
@@ -5306,7 +5114,7 @@
                 <ns0:sz ns0:val="18"/>
                 <ns0:szCs ns0:val="18"/>
               </ns0:rPr>
-              <ns0:t>3</ns0:t>
+              <ns0:t/>
             </ns0:r>
             <ns0:r>
               <ns0:rPr>
@@ -5315,7 +5123,7 @@
                 <ns0:sz ns0:val="18"/>
                 <ns0:szCs ns0:val="18"/>
               </ns0:rPr>
-              <ns0:t>00m</ns0:t>
+              <ns0:t/>
             </ns0:r>
           </ns0:p>
         </ns0:tc>
@@ -5365,7 +5173,7 @@
                 <ns0:sz ns0:val="18"/>
                 <ns0:szCs ns0:val="18"/>
               </ns0:rPr>
-              <ns0:t>J</ns0:t>
+              <ns0:t> </ns0:t>
             </ns0:r>
             <ns0:r ns0:rsidRPr="00D14B19">
               <ns0:rPr>
@@ -5374,7 +5182,7 @@
                 <ns0:sz ns0:val="18"/>
                 <ns0:szCs ns0:val="18"/>
               </ns0:rPr>
-              <ns0:t>L0A107-3</ns0:t>
+              <ns0:t/>
             </ns0:r>
           </ns0:p>
         </ns0:tc>
@@ -5424,7 +5232,7 @@
                 <ns0:sz ns0:val="18"/>
                 <ns0:szCs ns0:val="18"/>
               </ns0:rPr>
-              <ns0:t>(</ns0:t>
+              <ns0:t> </ns0:t>
             </ns0:r>
             <ns0:r ns0:rsidRPr="00EF169E">
               <ns0:rPr>
@@ -5433,7 +5241,7 @@
                 <ns0:sz ns0:val="18"/>
                 <ns0:szCs ns0:val="18"/>
               </ns0:rPr>
-              <ns0:t>0</ns0:t>
+              <ns0:t/>
             </ns0:r>
             <ns0:r ns0:rsidRPr="00EF169E">
               <ns0:rPr>
@@ -5442,7 +5250,7 @@
                 <ns0:sz ns0:val="18"/>
                 <ns0:szCs ns0:val="18"/>
               </ns0:rPr>
-              <ns0:t>-300)mm</ns0:t>
+              <ns0:t/>
             </ns0:r>
           </ns0:p>
         </ns0:tc>
@@ -5492,7 +5300,7 @@
                 <ns0:sz ns0:val="18"/>
                 <ns0:szCs ns0:val="18"/>
               </ns0:rPr>
-              <ns0:t>长度</ns0:t>
+              <ns0:t> </ns0:t>
             </ns0:r>
             <ns0:r>
               <ns0:rPr>
@@ -5501,7 +5309,7 @@
                 <ns0:sz ns0:val="18"/>
                 <ns0:szCs ns0:val="18"/>
               </ns0:rPr>
-              <ns0:t>：</ns0:t>
+              <ns0:t/>
             </ns0:r>
             <ns0:r ns0:rsidRPr="00E57CB9">
               <ns0:rPr>
@@ -5511,7 +5319,7 @@
                 <ns0:sz ns0:val="18"/>
                 <ns0:szCs ns0:val="18"/>
               </ns0:rPr>
-              <ns0:t>U</ns0:t>
+              <ns0:t/>
             </ns0:r>
             <ns0:r>
               <ns0:rPr>
@@ -5520,7 +5328,7 @@
                 <ns0:sz ns0:val="18"/>
                 <ns0:szCs ns0:val="18"/>
               </ns0:rPr>
-              <ns0:t>=0.09mm</ns0:t>
+              <ns0:t/>
             </ns0:r>
             <ns0:r>
               <ns0:rPr>
@@ -5529,7 +5337,7 @@
                 <ns0:sz ns0:val="18"/>
                 <ns0:szCs ns0:val="18"/>
               </ns0:rPr>
-              <ns0:t>，</ns0:t>
+              <ns0:t/>
             </ns0:r>
             <ns0:r ns0:rsidRPr="00E57CB9">
               <ns0:rPr>
@@ -5539,7 +5347,7 @@
                 <ns0:sz ns0:val="18"/>
                 <ns0:szCs ns0:val="18"/>
               </ns0:rPr>
-              <ns0:t>k</ns0:t>
+              <ns0:t/>
             </ns0:r>
             <ns0:r>
               <ns0:rPr>
@@ -5548,7 +5356,7 @@
                 <ns0:sz ns0:val="18"/>
                 <ns0:szCs ns0:val="18"/>
               </ns0:rPr>
-              <ns0:t>=</ns0:t>
+              <ns0:t/>
             </ns0:r>
             <ns0:r>
               <ns0:rPr>
@@ -5557,7 +5365,7 @@
                 <ns0:sz ns0:val="18"/>
                 <ns0:szCs ns0:val="18"/>
               </ns0:rPr>
-              <ns0:t>2</ns0:t>
+              <ns0:t/>
             </ns0:r>
           </ns0:p>
         </ns0:tc>
@@ -5607,7 +5415,7 @@
                 <ns0:sz ns0:val="18"/>
                 <ns0:szCs ns0:val="18"/>
               </ns0:rPr>
-              <ns0:t>J24207S03515</ns0:t>
+              <ns0:t> </ns0:t>
             </ns0:r>
           </ns0:p>
           <ns0:p ns0:rsidR="000D4836" ns0:rsidRPr="00D14B19" ns0:rsidRDefault="000D4836" ns0:rsidP="000D4836">
@@ -5630,7 +5438,7 @@
                 <ns0:sz ns0:val="18"/>
                 <ns0:szCs ns0:val="18"/>
               </ns0:rPr>
-              <ns0:t>2026</ns0:t>
+              <ns0:t/>
             </ns0:r>
             <ns0:r ns0:rsidRPr="00D14B19">
               <ns0:rPr>
@@ -5639,7 +5447,7 @@
                 <ns0:sz ns0:val="18"/>
                 <ns0:szCs ns0:val="18"/>
               </ns0:rPr>
-              <ns0:t>年</ns0:t>
+              <ns0:t/>
             </ns0:r>
             <ns0:r>
               <ns0:rPr>
@@ -5648,7 +5456,7 @@
                 <ns0:sz ns0:val="18"/>
                 <ns0:szCs ns0:val="18"/>
               </ns0:rPr>
-              <ns0:t>06</ns0:t>
+              <ns0:t/>
             </ns0:r>
             <ns0:r ns0:rsidRPr="00D14B19">
               <ns0:rPr>
@@ -5657,7 +5465,7 @@
                 <ns0:sz ns0:val="18"/>
                 <ns0:szCs ns0:val="18"/>
               </ns0:rPr>
-              <ns0:t>月</ns0:t>
+              <ns0:t/>
             </ns0:r>
             <ns0:r>
               <ns0:rPr>
@@ -5666,7 +5474,7 @@
                 <ns0:sz ns0:val="18"/>
                 <ns0:szCs ns0:val="18"/>
               </ns0:rPr>
-              <ns0:t>24</ns0:t>
+              <ns0:t/>
             </ns0:r>
             <ns0:r ns0:rsidRPr="00D14B19">
               <ns0:rPr>
@@ -5675,7 +5483,7 @@
                 <ns0:sz ns0:val="18"/>
                 <ns0:szCs ns0:val="18"/>
               </ns0:rPr>
-              <ns0:t>日</ns0:t>
+              <ns0:t/>
             </ns0:r>
           </ns0:p>
         </ns0:tc>
@@ -5725,7 +5533,7 @@
                 <ns0:sz ns0:val="18"/>
                 <ns0:szCs ns0:val="18"/>
               </ns0:rPr>
-              <ns0:t>S</ns0:t>
+              <ns0:t> </ns0:t>
             </ns0:r>
             <ns0:r>
               <ns0:rPr>
@@ -5734,1171 +5542,8 @@
                 <ns0:sz ns0:val="18"/>
                 <ns0:szCs ns0:val="18"/>
               </ns0:rPr>
-              <ns0:t>QI</ns0:t>
-            </ns0:r>
-          </ns0:p>
-        </ns0:tc>
-      </ns0:tr>
-      <ns0:tr ns0:rsidR="000D4836" ns0:rsidTr="00042401">
-        <ns0:trPr>
-          <ns0:trHeight ns0:val="567"/>
-          <ns0:jc ns0:val="center"/>
-        </ns0:trPr>
-        <ns0:tc>
-          <ns0:tcPr>
-            <ns0:tcW ns0:w="1115" ns0:type="dxa"/>
-            <ns0:gridSpan ns0:val="2"/>
-            <ns0:tcBorders>
-              <ns0:top ns0:val="nil"/>
-              <ns0:left ns0:val="dotted" ns0:sz="4" ns0:space="0" ns0:color="auto"/>
-              <ns0:bottom ns0:val="nil"/>
-              <ns0:right ns0:val="dotted" ns0:sz="4" ns0:space="0" ns0:color="auto"/>
-            </ns0:tcBorders>
-            <ns0:vAlign ns0:val="center"/>
-          </ns0:tcPr>
-          <ns0:p ns0:rsidR="000D4836" ns0:rsidRPr="00D14B19" ns0:rsidRDefault="000D4836" ns0:rsidP="000D4836">
-            <ns0:pPr>
-              <ns0:autoSpaceDE ns0:val="0"/>
-              <ns0:autoSpaceDN ns0:val="0"/>
-              <ns0:adjustRightInd ns0:val="0"/>
-              <ns0:jc ns0:val="center"/>
-              <ns0:rPr>
-                <ns0:rFonts ns0:ascii="Times New Roman" ns0:eastAsia="宋体" ns0:hAnsi="Times New Roman"/>
-                <ns0:color ns0:val="000000"/>
-                <ns0:sz ns0:val="18"/>
-                <ns0:szCs ns0:val="18"/>
-              </ns0:rPr>
-            </ns0:pPr>
-            <ns0:r ns0:rsidRPr="00D14B19">
-              <ns0:rPr>
-                <ns0:rFonts ns0:ascii="Times New Roman" ns0:eastAsia="宋体" ns0:hAnsi="Times New Roman" ns0:hint="eastAsia"/>
-                <ns0:color ns0:val="000000"/>
-                <ns0:sz ns0:val="18"/>
-                <ns0:szCs ns0:val="18"/>
-              </ns0:rPr>
-              <ns0:t>电子秒表</ns0:t>
-            </ns0:r>
-          </ns0:p>
-        </ns0:tc>
-        <ns0:tc>
-          <ns0:tcPr>
-            <ns0:tcW ns0:w="1119" ns0:type="dxa"/>
-            <ns0:gridSpan ns0:val="2"/>
-            <ns0:tcBorders>
-              <ns0:top ns0:val="nil"/>
-              <ns0:left ns0:val="dotted" ns0:sz="4" ns0:space="0" ns0:color="auto"/>
-              <ns0:bottom ns0:val="nil"/>
-              <ns0:right ns0:val="dotted" ns0:sz="4" ns0:space="0" ns0:color="auto"/>
-            </ns0:tcBorders>
-            <ns0:vAlign ns0:val="center"/>
-          </ns0:tcPr>
-          <ns0:p ns0:rsidR="000D4836" ns0:rsidRPr="008D23CF" ns0:rsidRDefault="000D4836" ns0:rsidP="000D4836">
-            <ns0:pPr>
-              <ns0:autoSpaceDE ns0:val="0"/>
-              <ns0:autoSpaceDN ns0:val="0"/>
-              <ns0:adjustRightInd ns0:val="0"/>
-              <ns0:jc ns0:val="center"/>
-              <ns0:rPr>
-                <ns0:rFonts ns0:ascii="Times New Roman" ns0:eastAsia="宋体" ns0:hAnsi="Times New Roman"/>
-                <ns0:color ns0:val="000000"/>
-                <ns0:sz ns0:val="18"/>
-                <ns0:szCs ns0:val="18"/>
-              </ns0:rPr>
-            </ns0:pPr>
-            <ns0:r>
-              <ns0:rPr>
-                <ns0:rFonts ns0:ascii="Times New Roman" ns0:eastAsia="宋体" ns0:hAnsi="Times New Roman"/>
-                <ns0:color ns0:val="000000"/>
-                <ns0:sz ns0:val="18"/>
-                <ns0:szCs ns0:val="18"/>
-              </ns0:rPr>
-              <ns0:t>SJ</ns0:t>
-            </ns0:r>
-            <ns0:r>
-              <ns0:rPr>
-                <ns0:rFonts ns0:ascii="Times New Roman" ns0:eastAsia="宋体" ns0:hAnsi="Times New Roman" ns0:hint="eastAsia"/>
-                <ns0:color ns0:val="000000"/>
-                <ns0:sz ns0:val="18"/>
-                <ns0:szCs ns0:val="18"/>
-              </ns0:rPr>
-              <ns0:t>9-</ns0:t>
-            </ns0:r>
-            <ns0:r>
-              <ns0:rPr>
-                <ns0:rFonts ns0:ascii="Times New Roman" ns0:eastAsia="宋体" ns0:hAnsi="Times New Roman"/>
-                <ns0:color ns0:val="000000"/>
-                <ns0:sz ns0:val="18"/>
-                <ns0:szCs ns0:val="18"/>
-              </ns0:rPr>
-              <ns0:t>II</ns0:t>
-            </ns0:r>
-          </ns0:p>
-        </ns0:tc>
-        <ns0:tc>
-          <ns0:tcPr>
-            <ns0:tcW ns0:w="1027" ns0:type="dxa"/>
-            <ns0:gridSpan ns0:val="2"/>
-            <ns0:tcBorders>
-              <ns0:top ns0:val="nil"/>
-              <ns0:left ns0:val="dotted" ns0:sz="4" ns0:space="0" ns0:color="auto"/>
-              <ns0:bottom ns0:val="nil"/>
-              <ns0:right ns0:val="dotted" ns0:sz="4" ns0:space="0" ns0:color="auto"/>
-            </ns0:tcBorders>
-            <ns0:vAlign ns0:val="center"/>
-          </ns0:tcPr>
-          <ns0:p ns0:rsidR="000D4836" ns0:rsidRPr="00D14B19" ns0:rsidRDefault="000D4836" ns0:rsidP="000D4836">
-            <ns0:pPr>
-              <ns0:autoSpaceDE ns0:val="0"/>
-              <ns0:autoSpaceDN ns0:val="0"/>
-              <ns0:adjustRightInd ns0:val="0"/>
-              <ns0:jc ns0:val="center"/>
-              <ns0:rPr>
-                <ns0:rFonts ns0:ascii="Times New Roman" ns0:eastAsia="宋体" ns0:hAnsi="Times New Roman"/>
-                <ns0:color ns0:val="000000"/>
-                <ns0:sz ns0:val="18"/>
-                <ns0:szCs ns0:val="18"/>
-              </ns0:rPr>
-            </ns0:pPr>
-            <ns0:r>
-              <ns0:rPr>
-                <ns0:rFonts ns0:ascii="Times New Roman" ns0:eastAsia="宋体" ns0:hAnsi="Times New Roman" ns0:hint="eastAsia"/>
-                <ns0:color ns0:val="000000"/>
-                <ns0:sz ns0:val="18"/>
-                <ns0:szCs ns0:val="18"/>
-              </ns0:rPr>
-              <ns0:t>JL0</ns0:t>
-            </ns0:r>
-            <ns0:r>
-              <ns0:rPr>
-                <ns0:rFonts ns0:ascii="Times New Roman" ns0:eastAsia="宋体" ns0:hAnsi="Times New Roman"/>
-                <ns0:color ns0:val="000000"/>
-                <ns0:sz ns0:val="18"/>
-                <ns0:szCs ns0:val="18"/>
-              </ns0:rPr>
-              <ns0:t>050</ns0:t>
-            </ns0:r>
-            <ns0:r>
-              <ns0:rPr>
-                <ns0:rFonts ns0:ascii="Times New Roman" ns0:eastAsia="宋体" ns0:hAnsi="Times New Roman" ns0:hint="eastAsia"/>
-                <ns0:color ns0:val="000000"/>
-                <ns0:sz ns0:val="18"/>
-                <ns0:szCs ns0:val="18"/>
-              </ns0:rPr>
-              <ns0:t>-</ns0:t>
-            </ns0:r>
-            <ns0:r>
-              <ns0:rPr>
-                <ns0:rFonts ns0:ascii="Times New Roman" ns0:eastAsia="宋体" ns0:hAnsi="Times New Roman"/>
-                <ns0:color ns0:val="000000"/>
-                <ns0:sz ns0:val="18"/>
-                <ns0:szCs ns0:val="18"/>
-              </ns0:rPr>
-              <ns0:t>1</ns0:t>
-            </ns0:r>
-          </ns0:p>
-        </ns0:tc>
-        <ns0:tc>
-          <ns0:tcPr>
-            <ns0:tcW ns0:w="1912" ns0:type="dxa"/>
-            <ns0:gridSpan ns0:val="4"/>
-            <ns0:tcBorders>
-              <ns0:top ns0:val="nil"/>
-              <ns0:left ns0:val="dotted" ns0:sz="4" ns0:space="0" ns0:color="auto"/>
-              <ns0:bottom ns0:val="nil"/>
-              <ns0:right ns0:val="dotted" ns0:sz="4" ns0:space="0" ns0:color="auto"/>
-            </ns0:tcBorders>
-            <ns0:vAlign ns0:val="center"/>
-          </ns0:tcPr>
-          <ns0:p ns0:rsidR="000D4836" ns0:rsidRPr="00EF169E" ns0:rsidRDefault="000D4836" ns0:rsidP="000D4836">
-            <ns0:pPr>
-              <ns0:autoSpaceDE ns0:val="0"/>
-              <ns0:autoSpaceDN ns0:val="0"/>
-              <ns0:adjustRightInd ns0:val="0"/>
-              <ns0:jc ns0:val="center"/>
-              <ns0:rPr>
-                <ns0:rFonts ns0:ascii="Times New Roman" ns0:eastAsia="宋体" ns0:hAnsi="Times New Roman"/>
-                <ns0:color ns0:val="000000"/>
-                <ns0:sz ns0:val="18"/>
-                <ns0:szCs ns0:val="18"/>
-              </ns0:rPr>
-            </ns0:pPr>
-            <ns0:r ns0:rsidRPr="00EF169E">
-              <ns0:rPr>
-                <ns0:rFonts ns0:ascii="Times New Roman" ns0:eastAsia="宋体" ns0:hAnsi="Times New Roman" ns0:hint="eastAsia"/>
-                <ns0:color ns0:val="000000"/>
-                <ns0:sz ns0:val="18"/>
-                <ns0:szCs ns0:val="18"/>
-              </ns0:rPr>
-              <ns0:t>10s</ns0:t>
-            </ns0:r>
-            <ns0:r ns0:rsidRPr="00EF169E">
-              <ns0:rPr>
-                <ns0:rFonts ns0:ascii="Times New Roman" ns0:eastAsia="宋体" ns0:hAnsi="Times New Roman" ns0:hint="eastAsia"/>
-                <ns0:color ns0:val="000000"/>
-                <ns0:sz ns0:val="18"/>
-                <ns0:szCs ns0:val="18"/>
-              </ns0:rPr>
-              <ns0:t>～</ns0:t>
-            </ns0:r>
-            <ns0:r ns0:rsidRPr="00EF169E">
-              <ns0:rPr>
-                <ns0:rFonts ns0:ascii="Times New Roman" ns0:eastAsia="宋体" ns0:hAnsi="Times New Roman" ns0:hint="eastAsia"/>
-                <ns0:color ns0:val="000000"/>
-                <ns0:sz ns0:val="18"/>
-                <ns0:szCs ns0:val="18"/>
-              </ns0:rPr>
-              <ns0:t>1h</ns0:t>
-            </ns0:r>
-          </ns0:p>
-        </ns0:tc>
-        <ns0:tc>
-          <ns0:tcPr>
-            <ns0:tcW ns0:w="2237" ns0:type="dxa"/>
-            <ns0:gridSpan ns0:val="4"/>
-            <ns0:tcBorders>
-              <ns0:top ns0:val="nil"/>
-              <ns0:left ns0:val="dotted" ns0:sz="4" ns0:space="0" ns0:color="auto"/>
-              <ns0:bottom ns0:val="nil"/>
-              <ns0:right ns0:val="dotted" ns0:sz="4" ns0:space="0" ns0:color="auto"/>
-            </ns0:tcBorders>
-            <ns0:vAlign ns0:val="center"/>
-          </ns0:tcPr>
-          <ns0:p ns0:rsidR="000D4836" ns0:rsidRDefault="000D4836" ns0:rsidP="000D4836">
-            <ns0:pPr>
-              <ns0:autoSpaceDE ns0:val="0"/>
-              <ns0:autoSpaceDN ns0:val="0"/>
-              <ns0:adjustRightInd ns0:val="0"/>
-              <ns0:jc ns0:val="center"/>
-              <ns0:rPr>
-                <ns0:rFonts ns0:ascii="Times New Roman" ns0:eastAsia="宋体" ns0:hAnsi="Times New Roman"/>
-                <ns0:color ns0:val="000000"/>
-                <ns0:sz ns0:val="18"/>
-                <ns0:szCs ns0:val="18"/>
-              </ns0:rPr>
-            </ns0:pPr>
-          </ns0:p>
-          <ns0:p ns0:rsidR="000D4836" ns0:rsidRPr="00EF169E" ns0:rsidRDefault="000D4836" ns0:rsidP="000D4836">
-            <ns0:pPr>
-              <ns0:autoSpaceDE ns0:val="0"/>
-              <ns0:autoSpaceDN ns0:val="0"/>
-              <ns0:adjustRightInd ns0:val="0"/>
-              <ns0:jc ns0:val="center"/>
-              <ns0:rPr>
-                <ns0:rFonts ns0:ascii="Times New Roman" ns0:eastAsia="宋体" ns0:hAnsi="Times New Roman"/>
-                <ns0:color ns0:val="000000"/>
-                <ns0:sz ns0:val="18"/>
-                <ns0:szCs ns0:val="18"/>
-              </ns0:rPr>
-            </ns0:pPr>
-            <ns0:r>
-              <ns0:rPr>
-                <ns0:rFonts ns0:ascii="Times New Roman" ns0:eastAsia="宋体" ns0:hAnsi="Times New Roman" ns0:hint="eastAsia"/>
-                <ns0:color ns0:val="000000"/>
-                <ns0:sz ns0:val="18"/>
-                <ns0:szCs ns0:val="18"/>
-              </ns0:rPr>
-              <ns0:t>时间</ns0:t>
-            </ns0:r>
-            <ns0:r ns0:rsidRPr="00EF169E">
-              <ns0:rPr>
-                <ns0:rFonts ns0:ascii="Times New Roman" ns0:eastAsia="宋体" ns0:hAnsi="Times New Roman" ns0:hint="eastAsia"/>
-                <ns0:color ns0:val="000000"/>
-                <ns0:sz ns0:val="18"/>
-                <ns0:szCs ns0:val="18"/>
-              </ns0:rPr>
-              <ns0:t>间隔</ns0:t>
-            </ns0:r>
-            <ns0:r>
-              <ns0:rPr>
-                <ns0:rFonts ns0:ascii="Times New Roman" ns0:eastAsia="宋体" ns0:hAnsi="Times New Roman" ns0:hint="eastAsia"/>
-                <ns0:color ns0:val="000000"/>
-                <ns0:sz ns0:val="18"/>
-                <ns0:szCs ns0:val="18"/>
-              </ns0:rPr>
-              <ns0:t>：</ns0:t>
-            </ns0:r>
-            <ns0:r ns0:rsidRPr="00EF169E">
-              <ns0:rPr>
-                <ns0:rFonts ns0:ascii="Times New Roman" ns0:eastAsia="宋体" ns0:hAnsi="Times New Roman" ns0:hint="eastAsia"/>
-                <ns0:i/>
-                <ns0:color ns0:val="000000"/>
-                <ns0:sz ns0:val="18"/>
-                <ns0:szCs ns0:val="18"/>
-              </ns0:rPr>
-              <ns0:t>U</ns0:t>
-            </ns0:r>
-            <ns0:r ns0:rsidRPr="00EF169E">
-              <ns0:rPr>
-                <ns0:rFonts ns0:ascii="Times New Roman" ns0:eastAsia="宋体" ns0:hAnsi="Times New Roman" ns0:hint="eastAsia"/>
-                <ns0:color ns0:val="000000"/>
-                <ns0:sz ns0:val="18"/>
-                <ns0:szCs ns0:val="18"/>
-              </ns0:rPr>
-              <ns0:t>=0.01s</ns0:t>
-            </ns0:r>
-            <ns0:r ns0:rsidRPr="00EF169E">
-              <ns0:rPr>
-                <ns0:rFonts ns0:ascii="Times New Roman" ns0:eastAsia="宋体" ns0:hAnsi="Times New Roman" ns0:hint="eastAsia"/>
-                <ns0:color ns0:val="000000"/>
-                <ns0:sz ns0:val="18"/>
-                <ns0:szCs ns0:val="18"/>
-              </ns0:rPr>
-              <ns0:t>，</ns0:t>
-            </ns0:r>
-            <ns0:r ns0:rsidRPr="00EF169E">
-              <ns0:rPr>
-                <ns0:rFonts ns0:ascii="Times New Roman" ns0:eastAsia="宋体" ns0:hAnsi="Times New Roman" ns0:hint="eastAsia"/>
-                <ns0:i/>
-                <ns0:color ns0:val="000000"/>
-                <ns0:sz ns0:val="18"/>
-                <ns0:szCs ns0:val="18"/>
-              </ns0:rPr>
-              <ns0:t>k</ns0:t>
-            </ns0:r>
-            <ns0:r ns0:rsidRPr="00EF169E">
-              <ns0:rPr>
-                <ns0:rFonts ns0:ascii="Times New Roman" ns0:eastAsia="宋体" ns0:hAnsi="Times New Roman" ns0:hint="eastAsia"/>
-                <ns0:color ns0:val="000000"/>
-                <ns0:sz ns0:val="18"/>
-                <ns0:szCs ns0:val="18"/>
-              </ns0:rPr>
-              <ns0:t>=2</ns0:t>
-            </ns0:r>
-          </ns0:p>
-          <ns0:p ns0:rsidR="000D4836" ns0:rsidRPr="008D23CF" ns0:rsidRDefault="000D4836" ns0:rsidP="000D4836">
-            <ns0:pPr>
-              <ns0:autoSpaceDE ns0:val="0"/>
-              <ns0:autoSpaceDN ns0:val="0"/>
-              <ns0:adjustRightInd ns0:val="0"/>
-              <ns0:jc ns0:val="center"/>
-              <ns0:rPr>
-                <ns0:rFonts ns0:ascii="Times New Roman" ns0:eastAsia="宋体" ns0:hAnsi="Times New Roman"/>
-                <ns0:i/>
-                <ns0:color ns0:val="000000"/>
-                <ns0:sz ns0:val="18"/>
-                <ns0:szCs ns0:val="18"/>
-              </ns0:rPr>
-            </ns0:pPr>
-            <ns0:r ns0:rsidRPr="00EF169E">
-              <ns0:rPr>
-                <ns0:rFonts ns0:ascii="Times New Roman" ns0:eastAsia="宋体" ns0:hAnsi="Times New Roman" ns0:hint="eastAsia"/>
-                <ns0:color ns0:val="000000"/>
-                <ns0:sz ns0:val="18"/>
-                <ns0:szCs ns0:val="18"/>
-              </ns0:rPr>
-              <ns0:t>日差</ns0:t>
-            </ns0:r>
-            <ns0:r>
-              <ns0:rPr>
-                <ns0:rFonts ns0:ascii="Times New Roman" ns0:eastAsia="宋体" ns0:hAnsi="Times New Roman" ns0:hint="eastAsia"/>
-                <ns0:color ns0:val="000000"/>
-                <ns0:sz ns0:val="18"/>
-                <ns0:szCs ns0:val="18"/>
-              </ns0:rPr>
-              <ns0:t>：</ns0:t>
-            </ns0:r>
-            <ns0:r ns0:rsidRPr="00EF169E">
-              <ns0:rPr>
-                <ns0:rFonts ns0:ascii="Times New Roman" ns0:eastAsia="宋体" ns0:hAnsi="Times New Roman" ns0:hint="eastAsia"/>
-                <ns0:i/>
-                <ns0:color ns0:val="000000"/>
-                <ns0:sz ns0:val="18"/>
-                <ns0:szCs ns0:val="18"/>
-              </ns0:rPr>
-              <ns0:t>U</ns0:t>
-            </ns0:r>
-            <ns0:r ns0:rsidRPr="00EF169E">
-              <ns0:rPr>
-                <ns0:rFonts ns0:ascii="Times New Roman" ns0:eastAsia="宋体" ns0:hAnsi="Times New Roman" ns0:hint="eastAsia"/>
-                <ns0:color ns0:val="000000"/>
-                <ns0:sz ns0:val="18"/>
-                <ns0:szCs ns0:val="18"/>
-              </ns0:rPr>
-              <ns0:t>=0.01s</ns0:t>
-            </ns0:r>
-            <ns0:r ns0:rsidRPr="00EF169E">
-              <ns0:rPr>
-                <ns0:rFonts ns0:ascii="Times New Roman" ns0:eastAsia="宋体" ns0:hAnsi="Times New Roman" ns0:hint="eastAsia"/>
-                <ns0:color ns0:val="000000"/>
-                <ns0:sz ns0:val="18"/>
-                <ns0:szCs ns0:val="18"/>
-              </ns0:rPr>
-              <ns0:t>，</ns0:t>
-            </ns0:r>
-            <ns0:r ns0:rsidRPr="00EF169E">
-              <ns0:rPr>
-                <ns0:rFonts ns0:ascii="Times New Roman" ns0:eastAsia="宋体" ns0:hAnsi="Times New Roman" ns0:hint="eastAsia"/>
-                <ns0:i/>
-                <ns0:color ns0:val="000000"/>
-                <ns0:sz ns0:val="18"/>
-                <ns0:szCs ns0:val="18"/>
-              </ns0:rPr>
-              <ns0:t>k</ns0:t>
-            </ns0:r>
-            <ns0:r ns0:rsidRPr="00EF169E">
-              <ns0:rPr>
-                <ns0:rFonts ns0:ascii="Times New Roman" ns0:eastAsia="宋体" ns0:hAnsi="Times New Roman" ns0:hint="eastAsia"/>
-                <ns0:color ns0:val="000000"/>
-                <ns0:sz ns0:val="18"/>
-                <ns0:szCs ns0:val="18"/>
-              </ns0:rPr>
-              <ns0:t>=2</ns0:t>
-            </ns0:r>
-          </ns0:p>
-        </ns0:tc>
-        <ns0:tc>
-          <ns0:tcPr>
-            <ns0:tcW ns0:w="2242" ns0:type="dxa"/>
-            <ns0:gridSpan ns0:val="5"/>
-            <ns0:tcBorders>
-              <ns0:top ns0:val="nil"/>
-              <ns0:left ns0:val="dotted" ns0:sz="4" ns0:space="0" ns0:color="auto"/>
-              <ns0:bottom ns0:val="nil"/>
-              <ns0:right ns0:val="dotted" ns0:sz="4" ns0:space="0" ns0:color="auto"/>
-            </ns0:tcBorders>
-            <ns0:vAlign ns0:val="center"/>
-          </ns0:tcPr>
-          <ns0:p ns0:rsidR="000D4836" ns0:rsidRDefault="000D4836" ns0:rsidP="000D4836">
-            <ns0:pPr>
-              <ns0:autoSpaceDE ns0:val="0"/>
-              <ns0:autoSpaceDN ns0:val="0"/>
-              <ns0:adjustRightInd ns0:val="0"/>
-              <ns0:jc ns0:val="center"/>
-              <ns0:rPr>
-                <ns0:rFonts ns0:ascii="Times New Roman" ns0:eastAsia="宋体" ns0:hAnsi="Times New Roman"/>
-                <ns0:color ns0:val="000000"/>
-                <ns0:sz ns0:val="18"/>
-                <ns0:szCs ns0:val="18"/>
-              </ns0:rPr>
-            </ns0:pPr>
-          </ns0:p>
-          <ns0:p ns0:rsidR="000D4836" ns0:rsidRPr="00D14B19" ns0:rsidRDefault="000D4836" ns0:rsidP="000D4836">
-            <ns0:pPr>
-              <ns0:autoSpaceDE ns0:val="0"/>
-              <ns0:autoSpaceDN ns0:val="0"/>
-              <ns0:adjustRightInd ns0:val="0"/>
-              <ns0:jc ns0:val="center"/>
-              <ns0:rPr>
-                <ns0:rFonts ns0:ascii="Times New Roman" ns0:eastAsia="宋体" ns0:hAnsi="Times New Roman"/>
-                <ns0:color ns0:val="000000"/>
-                <ns0:sz ns0:val="18"/>
-                <ns0:szCs ns0:val="18"/>
-              </ns0:rPr>
-            </ns0:pPr>
-            <ns0:r ns0:rsidRPr="00164352">
-              <ns0:rPr>
-                <ns0:rFonts ns0:ascii="Times New Roman" ns0:eastAsia="宋体" ns0:hAnsi="Times New Roman"/>
-                <ns0:color ns0:val="000000"/>
-                <ns0:sz ns0:val="18"/>
-                <ns0:szCs ns0:val="18"/>
-              </ns0:rPr>
-              <ns0:t>J25139S00576</ns0:t>
-            </ns0:r>
-          </ns0:p>
-          <ns0:p ns0:rsidR="000D4836" ns0:rsidRPr="00D14B19" ns0:rsidRDefault="000D4836" ns0:rsidP="000D4836">
-            <ns0:pPr>
-              <ns0:autoSpaceDE ns0:val="0"/>
-              <ns0:autoSpaceDN ns0:val="0"/>
-              <ns0:adjustRightInd ns0:val="0"/>
-              <ns0:jc ns0:val="center"/>
-              <ns0:rPr>
-                <ns0:rFonts ns0:ascii="Times New Roman" ns0:eastAsia="宋体" ns0:hAnsi="Times New Roman"/>
-                <ns0:color ns0:val="000000"/>
-                <ns0:sz ns0:val="18"/>
-                <ns0:szCs ns0:val="18"/>
-              </ns0:rPr>
-            </ns0:pPr>
-            <ns0:r>
-              <ns0:rPr>
-                <ns0:rFonts ns0:ascii="Times New Roman" ns0:eastAsia="宋体" ns0:hAnsi="Times New Roman" ns0:hint="eastAsia"/>
-                <ns0:color ns0:val="000000"/>
-                <ns0:sz ns0:val="18"/>
-                <ns0:szCs ns0:val="18"/>
-              </ns0:rPr>
-              <ns0:t>202</ns0:t>
-            </ns0:r>
-            <ns0:r>
-              <ns0:rPr>
-                <ns0:rFonts ns0:ascii="Times New Roman" ns0:eastAsia="宋体" ns0:hAnsi="Times New Roman"/>
-                <ns0:color ns0:val="000000"/>
-                <ns0:sz ns0:val="18"/>
-                <ns0:szCs ns0:val="18"/>
-              </ns0:rPr>
-              <ns0:t>6</ns0:t>
-            </ns0:r>
-            <ns0:r ns0:rsidRPr="00D14B19">
-              <ns0:rPr>
-                <ns0:rFonts ns0:ascii="Times New Roman" ns0:eastAsia="宋体" ns0:hAnsi="Times New Roman" ns0:hint="eastAsia"/>
-                <ns0:color ns0:val="000000"/>
-                <ns0:sz ns0:val="18"/>
-                <ns0:szCs ns0:val="18"/>
-              </ns0:rPr>
-              <ns0:t>年</ns0:t>
-            </ns0:r>
-            <ns0:r>
-              <ns0:rPr>
-                <ns0:rFonts ns0:ascii="Times New Roman" ns0:eastAsia="宋体" ns0:hAnsi="Times New Roman"/>
-                <ns0:color ns0:val="000000"/>
-                <ns0:sz ns0:val="18"/>
-                <ns0:szCs ns0:val="18"/>
-              </ns0:rPr>
-              <ns0:t>06</ns0:t>
-            </ns0:r>
-            <ns0:r ns0:rsidRPr="00D14B19">
-              <ns0:rPr>
-                <ns0:rFonts ns0:ascii="Times New Roman" ns0:eastAsia="宋体" ns0:hAnsi="Times New Roman" ns0:hint="eastAsia"/>
-                <ns0:color ns0:val="000000"/>
-                <ns0:sz ns0:val="18"/>
-                <ns0:szCs ns0:val="18"/>
-              </ns0:rPr>
-              <ns0:t>月</ns0:t>
-            </ns0:r>
-            <ns0:r>
-              <ns0:rPr>
-                <ns0:rFonts ns0:ascii="Times New Roman" ns0:eastAsia="宋体" ns0:hAnsi="Times New Roman"/>
-                <ns0:color ns0:val="000000"/>
-                <ns0:sz ns0:val="18"/>
-                <ns0:szCs ns0:val="18"/>
-              </ns0:rPr>
-              <ns0:t>10</ns0:t>
-            </ns0:r>
-            <ns0:r ns0:rsidRPr="00D14B19">
-              <ns0:rPr>
-                <ns0:rFonts ns0:ascii="Times New Roman" ns0:eastAsia="宋体" ns0:hAnsi="Times New Roman" ns0:hint="eastAsia"/>
-                <ns0:color ns0:val="000000"/>
-                <ns0:sz ns0:val="18"/>
-                <ns0:szCs ns0:val="18"/>
-              </ns0:rPr>
-              <ns0:t>日</ns0:t>
-            </ns0:r>
-          </ns0:p>
-        </ns0:tc>
-        <ns0:tc>
-          <ns0:tcPr>
-            <ns0:tcW ns0:w="1008" ns0:type="dxa"/>
-            <ns0:gridSpan ns0:val="2"/>
-            <ns0:tcBorders>
-              <ns0:top ns0:val="nil"/>
-              <ns0:left ns0:val="dotted" ns0:sz="4" ns0:space="0" ns0:color="auto"/>
-              <ns0:bottom ns0:val="nil"/>
-              <ns0:right ns0:val="dotted" ns0:sz="4" ns0:space="0" ns0:color="auto"/>
-            </ns0:tcBorders>
-            <ns0:vAlign ns0:val="center"/>
-          </ns0:tcPr>
-          <ns0:p ns0:rsidR="000D4836" ns0:rsidRPr="008D23CF" ns0:rsidRDefault="000D4836" ns0:rsidP="000D4836">
-            <ns0:pPr>
-              <ns0:autoSpaceDE ns0:val="0"/>
-              <ns0:autoSpaceDN ns0:val="0"/>
-              <ns0:adjustRightInd ns0:val="0"/>
-              <ns0:jc ns0:val="center"/>
-              <ns0:rPr>
-                <ns0:rFonts ns0:ascii="Times New Roman" ns0:eastAsia="宋体" ns0:hAnsi="Times New Roman"/>
-                <ns0:color ns0:val="000000"/>
-                <ns0:sz ns0:val="18"/>
-                <ns0:szCs ns0:val="18"/>
-              </ns0:rPr>
-            </ns0:pPr>
-            <ns0:r>
-              <ns0:rPr>
-                <ns0:rFonts ns0:ascii="Times New Roman" ns0:eastAsia="宋体" ns0:hAnsi="Times New Roman" ns0:hint="eastAsia"/>
-                <ns0:color ns0:val="000000"/>
-                <ns0:sz ns0:val="18"/>
-                <ns0:szCs ns0:val="18"/>
-              </ns0:rPr>
-              <ns0:t>S</ns0:t>
-            </ns0:r>
-            <ns0:r>
-              <ns0:rPr>
-                <ns0:rFonts ns0:ascii="Times New Roman" ns0:eastAsia="宋体" ns0:hAnsi="Times New Roman"/>
-                <ns0:color ns0:val="000000"/>
-                <ns0:sz ns0:val="18"/>
-                <ns0:szCs ns0:val="18"/>
-              </ns0:rPr>
-              <ns0:t>IMT</ns0:t>
-            </ns0:r>
-          </ns0:p>
-        </ns0:tc>
-      </ns0:tr>
-      <ns0:tr ns0:rsidR="003C3A8E" ns0:rsidTr="00042401">
-        <ns0:trPr>
-          <ns0:trHeight ns0:val="567"/>
-          <ns0:jc ns0:val="center"/>
-        </ns0:trPr>
-        <ns0:tc>
-          <ns0:tcPr>
-            <ns0:tcW ns0:w="1115" ns0:type="dxa"/>
-            <ns0:gridSpan ns0:val="2"/>
-            <ns0:tcBorders>
-              <ns0:top ns0:val="nil"/>
-              <ns0:left ns0:val="dotted" ns0:sz="4" ns0:space="0" ns0:color="auto"/>
-              <ns0:bottom ns0:val="nil"/>
-              <ns0:right ns0:val="dotted" ns0:sz="4" ns0:space="0" ns0:color="auto"/>
-            </ns0:tcBorders>
-            <ns0:vAlign ns0:val="center"/>
-          </ns0:tcPr>
-          <ns0:p ns0:rsidR="003C3A8E" ns0:rsidRPr="00B82D83" ns0:rsidRDefault="003C3A8E" ns0:rsidP="003C3A8E">
-            <ns0:pPr>
-              <ns0:autoSpaceDE ns0:val="0"/>
-              <ns0:autoSpaceDN ns0:val="0"/>
-              <ns0:adjustRightInd ns0:val="0"/>
-              <ns0:jc ns0:val="center"/>
-              <ns0:rPr>
-                <ns0:rFonts ns0:ascii="Times New Roman" ns0:eastAsia="宋体" ns0:hAnsi="Times New Roman"/>
-                <ns0:sz ns0:val="18"/>
-                <ns0:szCs ns0:val="18"/>
-              </ns0:rPr>
-            </ns0:pPr>
-          </ns0:p>
-        </ns0:tc>
-        <ns0:tc>
-          <ns0:tcPr>
-            <ns0:tcW ns0:w="1119" ns0:type="dxa"/>
-            <ns0:gridSpan ns0:val="2"/>
-            <ns0:tcBorders>
-              <ns0:top ns0:val="nil"/>
-              <ns0:left ns0:val="dotted" ns0:sz="4" ns0:space="0" ns0:color="auto"/>
-              <ns0:bottom ns0:val="nil"/>
-              <ns0:right ns0:val="dotted" ns0:sz="4" ns0:space="0" ns0:color="auto"/>
-            </ns0:tcBorders>
-            <ns0:vAlign ns0:val="center"/>
-          </ns0:tcPr>
-          <ns0:p ns0:rsidR="003C3A8E" ns0:rsidRPr="00B82D83" ns0:rsidRDefault="003C3A8E" ns0:rsidP="003C3A8E">
-            <ns0:pPr>
-              <ns0:autoSpaceDE ns0:val="0"/>
-              <ns0:autoSpaceDN ns0:val="0"/>
-              <ns0:adjustRightInd ns0:val="0"/>
-              <ns0:jc ns0:val="center"/>
-              <ns0:rPr>
-                <ns0:rFonts ns0:ascii="Times New Roman" ns0:eastAsia="宋体" ns0:hAnsi="Times New Roman"/>
-                <ns0:color ns0:val="000000"/>
-                <ns0:sz ns0:val="18"/>
-                <ns0:szCs ns0:val="18"/>
-              </ns0:rPr>
-            </ns0:pPr>
-          </ns0:p>
-        </ns0:tc>
-        <ns0:tc>
-          <ns0:tcPr>
-            <ns0:tcW ns0:w="1027" ns0:type="dxa"/>
-            <ns0:gridSpan ns0:val="2"/>
-            <ns0:tcBorders>
-              <ns0:top ns0:val="nil"/>
-              <ns0:left ns0:val="dotted" ns0:sz="4" ns0:space="0" ns0:color="auto"/>
-              <ns0:bottom ns0:val="nil"/>
-              <ns0:right ns0:val="dotted" ns0:sz="4" ns0:space="0" ns0:color="auto"/>
-            </ns0:tcBorders>
-            <ns0:vAlign ns0:val="center"/>
-          </ns0:tcPr>
-          <ns0:p ns0:rsidR="003C3A8E" ns0:rsidRPr="00B82D83" ns0:rsidRDefault="003C3A8E" ns0:rsidP="003C3A8E">
-            <ns0:pPr>
-              <ns0:autoSpaceDE ns0:val="0"/>
-              <ns0:autoSpaceDN ns0:val="0"/>
-              <ns0:adjustRightInd ns0:val="0"/>
-              <ns0:jc ns0:val="center"/>
-              <ns0:rPr>
-                <ns0:rFonts ns0:ascii="Times New Roman" ns0:eastAsia="宋体" ns0:hAnsi="Times New Roman"/>
-                <ns0:color ns0:val="000000"/>
-                <ns0:sz ns0:val="18"/>
-                <ns0:szCs ns0:val="18"/>
-              </ns0:rPr>
-            </ns0:pPr>
-          </ns0:p>
-        </ns0:tc>
-        <ns0:tc>
-          <ns0:tcPr>
-            <ns0:tcW ns0:w="1912" ns0:type="dxa"/>
-            <ns0:gridSpan ns0:val="4"/>
-            <ns0:tcBorders>
-              <ns0:top ns0:val="nil"/>
-              <ns0:left ns0:val="dotted" ns0:sz="4" ns0:space="0" ns0:color="auto"/>
-              <ns0:bottom ns0:val="nil"/>
-              <ns0:right ns0:val="dotted" ns0:sz="4" ns0:space="0" ns0:color="auto"/>
-            </ns0:tcBorders>
-            <ns0:vAlign ns0:val="center"/>
-          </ns0:tcPr>
-          <ns0:p ns0:rsidR="003C3A8E" ns0:rsidRPr="00B82D83" ns0:rsidRDefault="003C3A8E" ns0:rsidP="003C3A8E">
-            <ns0:pPr>
-              <ns0:autoSpaceDE ns0:val="0"/>
-              <ns0:autoSpaceDN ns0:val="0"/>
-              <ns0:adjustRightInd ns0:val="0"/>
-              <ns0:jc ns0:val="center"/>
-              <ns0:rPr>
-                <ns0:rFonts ns0:ascii="Times New Roman" ns0:eastAsia="宋体" ns0:hAnsi="Times New Roman"/>
-                <ns0:color ns0:val="000000"/>
-                <ns0:sz ns0:val="18"/>
-                <ns0:szCs ns0:val="18"/>
-              </ns0:rPr>
-            </ns0:pPr>
-          </ns0:p>
-        </ns0:tc>
-        <ns0:tc>
-          <ns0:tcPr>
-            <ns0:tcW ns0:w="2237" ns0:type="dxa"/>
-            <ns0:gridSpan ns0:val="4"/>
-            <ns0:tcBorders>
-              <ns0:top ns0:val="nil"/>
-              <ns0:left ns0:val="dotted" ns0:sz="4" ns0:space="0" ns0:color="auto"/>
-              <ns0:bottom ns0:val="nil"/>
-              <ns0:right ns0:val="dotted" ns0:sz="4" ns0:space="0" ns0:color="auto"/>
-            </ns0:tcBorders>
-            <ns0:vAlign ns0:val="center"/>
-          </ns0:tcPr>
-          <ns0:p ns0:rsidR="003C3A8E" ns0:rsidRPr="00B82D83" ns0:rsidRDefault="003C3A8E" ns0:rsidP="003C3A8E">
-            <ns0:pPr>
-              <ns0:autoSpaceDE ns0:val="0"/>
-              <ns0:autoSpaceDN ns0:val="0"/>
-              <ns0:adjustRightInd ns0:val="0"/>
-              <ns0:jc ns0:val="center"/>
-              <ns0:rPr>
-                <ns0:rFonts ns0:ascii="Times New Roman" ns0:eastAsia="宋体" ns0:hAnsi="Times New Roman"/>
-                <ns0:sz ns0:val="18"/>
-                <ns0:szCs ns0:val="18"/>
-              </ns0:rPr>
-            </ns0:pPr>
-          </ns0:p>
-        </ns0:tc>
-        <ns0:tc>
-          <ns0:tcPr>
-            <ns0:tcW ns0:w="2242" ns0:type="dxa"/>
-            <ns0:gridSpan ns0:val="5"/>
-            <ns0:tcBorders>
-              <ns0:top ns0:val="nil"/>
-              <ns0:left ns0:val="dotted" ns0:sz="4" ns0:space="0" ns0:color="auto"/>
-              <ns0:bottom ns0:val="nil"/>
-              <ns0:right ns0:val="dotted" ns0:sz="4" ns0:space="0" ns0:color="auto"/>
-            </ns0:tcBorders>
-            <ns0:vAlign ns0:val="center"/>
-          </ns0:tcPr>
-          <ns0:p ns0:rsidR="003C3A8E" ns0:rsidRPr="00B82D83" ns0:rsidRDefault="003C3A8E" ns0:rsidP="003C3A8E">
-            <ns0:pPr>
-              <ns0:autoSpaceDE ns0:val="0"/>
-              <ns0:autoSpaceDN ns0:val="0"/>
-              <ns0:adjustRightInd ns0:val="0"/>
-              <ns0:jc ns0:val="center"/>
-              <ns0:rPr>
-                <ns0:rFonts ns0:ascii="Times New Roman" ns0:eastAsia="宋体" ns0:hAnsi="Times New Roman"/>
-                <ns0:color ns0:val="000000"/>
-                <ns0:sz ns0:val="18"/>
-                <ns0:szCs ns0:val="18"/>
-              </ns0:rPr>
-            </ns0:pPr>
-          </ns0:p>
-        </ns0:tc>
-        <ns0:tc>
-          <ns0:tcPr>
-            <ns0:tcW ns0:w="1008" ns0:type="dxa"/>
-            <ns0:gridSpan ns0:val="2"/>
-            <ns0:tcBorders>
-              <ns0:top ns0:val="nil"/>
-              <ns0:left ns0:val="dotted" ns0:sz="4" ns0:space="0" ns0:color="auto"/>
-              <ns0:bottom ns0:val="nil"/>
-              <ns0:right ns0:val="dotted" ns0:sz="4" ns0:space="0" ns0:color="auto"/>
-            </ns0:tcBorders>
-            <ns0:vAlign ns0:val="center"/>
-          </ns0:tcPr>
-          <ns0:p ns0:rsidR="003C3A8E" ns0:rsidRPr="00B82D83" ns0:rsidRDefault="003C3A8E" ns0:rsidP="003C3A8E">
-            <ns0:pPr>
-              <ns0:autoSpaceDE ns0:val="0"/>
-              <ns0:autoSpaceDN ns0:val="0"/>
-              <ns0:adjustRightInd ns0:val="0"/>
-              <ns0:jc ns0:val="center"/>
-              <ns0:rPr>
-                <ns0:rFonts ns0:ascii="Times New Roman" ns0:eastAsia="宋体" ns0:hAnsi="Times New Roman"/>
-                <ns0:color ns0:val="000000"/>
-                <ns0:sz ns0:val="18"/>
-                <ns0:szCs ns0:val="18"/>
-              </ns0:rPr>
-            </ns0:pPr>
-          </ns0:p>
-        </ns0:tc>
-      </ns0:tr>
-      <ns0:tr ns0:rsidR="00EA4E64" ns0:rsidTr="00042401">
-        <ns0:trPr>
-          <ns0:trHeight ns0:val="567"/>
-          <ns0:jc ns0:val="center"/>
-        </ns0:trPr>
-        <ns0:tc>
-          <ns0:tcPr>
-            <ns0:tcW ns0:w="1115" ns0:type="dxa"/>
-            <ns0:gridSpan ns0:val="2"/>
-            <ns0:tcBorders>
-              <ns0:top ns0:val="nil"/>
-              <ns0:left ns0:val="dotted" ns0:sz="4" ns0:space="0" ns0:color="auto"/>
-              <ns0:bottom ns0:val="nil"/>
-              <ns0:right ns0:val="dotted" ns0:sz="4" ns0:space="0" ns0:color="auto"/>
-            </ns0:tcBorders>
-            <ns0:vAlign ns0:val="center"/>
-          </ns0:tcPr>
-          <ns0:p ns0:rsidR="00EA4E64" ns0:rsidRPr="00A212FE" ns0:rsidRDefault="00EA4E64" ns0:rsidP="00EA4E64">
-            <ns0:pPr>
-              <ns0:autoSpaceDE ns0:val="0"/>
-              <ns0:autoSpaceDN ns0:val="0"/>
-              <ns0:adjustRightInd ns0:val="0"/>
-              <ns0:jc ns0:val="center"/>
-              <ns0:rPr>
-                <ns0:rFonts ns0:ascii="Times New Roman" ns0:eastAsia="宋体" ns0:hAnsi="Times New Roman"/>
-                <ns0:color ns0:val="000000"/>
-                <ns0:sz ns0:val="18"/>
-                <ns0:szCs ns0:val="18"/>
-              </ns0:rPr>
-            </ns0:pPr>
-          </ns0:p>
-        </ns0:tc>
-        <ns0:tc>
-          <ns0:tcPr>
-            <ns0:tcW ns0:w="1119" ns0:type="dxa"/>
-            <ns0:gridSpan ns0:val="2"/>
-            <ns0:tcBorders>
-              <ns0:top ns0:val="nil"/>
-              <ns0:left ns0:val="dotted" ns0:sz="4" ns0:space="0" ns0:color="auto"/>
-              <ns0:bottom ns0:val="nil"/>
-              <ns0:right ns0:val="dotted" ns0:sz="4" ns0:space="0" ns0:color="auto"/>
-            </ns0:tcBorders>
-            <ns0:vAlign ns0:val="center"/>
-          </ns0:tcPr>
-          <ns0:p ns0:rsidR="00EA4E64" ns0:rsidRPr="00A212FE" ns0:rsidRDefault="00EA4E64" ns0:rsidP="00EA4E64">
-            <ns0:pPr>
-              <ns0:autoSpaceDE ns0:val="0"/>
-              <ns0:autoSpaceDN ns0:val="0"/>
-              <ns0:adjustRightInd ns0:val="0"/>
-              <ns0:jc ns0:val="center"/>
-              <ns0:rPr>
-                <ns0:rFonts ns0:ascii="Times New Roman" ns0:eastAsia="宋体" ns0:hAnsi="Times New Roman"/>
-                <ns0:color ns0:val="000000"/>
-                <ns0:sz ns0:val="18"/>
-                <ns0:szCs ns0:val="18"/>
-              </ns0:rPr>
-            </ns0:pPr>
-          </ns0:p>
-        </ns0:tc>
-        <ns0:tc>
-          <ns0:tcPr>
-            <ns0:tcW ns0:w="1027" ns0:type="dxa"/>
-            <ns0:gridSpan ns0:val="2"/>
-            <ns0:tcBorders>
-              <ns0:top ns0:val="nil"/>
-              <ns0:left ns0:val="dotted" ns0:sz="4" ns0:space="0" ns0:color="auto"/>
-              <ns0:bottom ns0:val="nil"/>
-              <ns0:right ns0:val="dotted" ns0:sz="4" ns0:space="0" ns0:color="auto"/>
-            </ns0:tcBorders>
-            <ns0:vAlign ns0:val="center"/>
-          </ns0:tcPr>
-          <ns0:p ns0:rsidR="00EA4E64" ns0:rsidRPr="00A212FE" ns0:rsidRDefault="00EA4E64" ns0:rsidP="00EA4E64">
-            <ns0:pPr>
-              <ns0:autoSpaceDE ns0:val="0"/>
-              <ns0:autoSpaceDN ns0:val="0"/>
-              <ns0:adjustRightInd ns0:val="0"/>
-              <ns0:jc ns0:val="center"/>
-              <ns0:rPr>
-                <ns0:rFonts ns0:ascii="Times New Roman" ns0:eastAsia="宋体" ns0:hAnsi="Times New Roman"/>
-                <ns0:color ns0:val="000000"/>
-                <ns0:sz ns0:val="18"/>
-                <ns0:szCs ns0:val="18"/>
-              </ns0:rPr>
-            </ns0:pPr>
-          </ns0:p>
-        </ns0:tc>
-        <ns0:tc>
-          <ns0:tcPr>
-            <ns0:tcW ns0:w="1912" ns0:type="dxa"/>
-            <ns0:gridSpan ns0:val="4"/>
-            <ns0:tcBorders>
-              <ns0:top ns0:val="nil"/>
-              <ns0:left ns0:val="dotted" ns0:sz="4" ns0:space="0" ns0:color="auto"/>
-              <ns0:bottom ns0:val="nil"/>
-              <ns0:right ns0:val="dotted" ns0:sz="4" ns0:space="0" ns0:color="auto"/>
-            </ns0:tcBorders>
-            <ns0:vAlign ns0:val="center"/>
-          </ns0:tcPr>
-          <ns0:p ns0:rsidR="00EA4E64" ns0:rsidRPr="00D27ACA" ns0:rsidRDefault="00EA4E64" ns0:rsidP="00EA4E64">
-            <ns0:pPr>
-              <ns0:autoSpaceDE ns0:val="0"/>
-              <ns0:autoSpaceDN ns0:val="0"/>
-              <ns0:adjustRightInd ns0:val="0"/>
-              <ns0:jc ns0:val="center"/>
-              <ns0:rPr>
-                <ns0:rFonts ns0:ascii="Times New Roman" ns0:eastAsia="宋体" ns0:hAnsi="Times New Roman"/>
-                <ns0:color ns0:val="000000"/>
-                <ns0:sz ns0:val="18"/>
-                <ns0:szCs ns0:val="18"/>
-              </ns0:rPr>
-            </ns0:pPr>
-          </ns0:p>
-        </ns0:tc>
-        <ns0:tc>
-          <ns0:tcPr>
-            <ns0:tcW ns0:w="2237" ns0:type="dxa"/>
-            <ns0:gridSpan ns0:val="4"/>
-            <ns0:tcBorders>
-              <ns0:top ns0:val="nil"/>
-              <ns0:left ns0:val="dotted" ns0:sz="4" ns0:space="0" ns0:color="auto"/>
-              <ns0:bottom ns0:val="nil"/>
-              <ns0:right ns0:val="dotted" ns0:sz="4" ns0:space="0" ns0:color="auto"/>
-            </ns0:tcBorders>
-            <ns0:vAlign ns0:val="center"/>
-          </ns0:tcPr>
-          <ns0:p ns0:rsidR="00EA4E64" ns0:rsidRPr="00D27ACA" ns0:rsidRDefault="00EA4E64" ns0:rsidP="00EA4E64">
-            <ns0:pPr>
-              <ns0:autoSpaceDE ns0:val="0"/>
-              <ns0:autoSpaceDN ns0:val="0"/>
-              <ns0:adjustRightInd ns0:val="0"/>
-              <ns0:jc ns0:val="center"/>
-              <ns0:rPr>
-                <ns0:rFonts ns0:ascii="Times New Roman" ns0:eastAsia="宋体" ns0:hAnsi="Times New Roman"/>
-                <ns0:color ns0:val="000000"/>
-                <ns0:sz ns0:val="18"/>
-                <ns0:szCs ns0:val="18"/>
-              </ns0:rPr>
-            </ns0:pPr>
-          </ns0:p>
-        </ns0:tc>
-        <ns0:tc>
-          <ns0:tcPr>
-            <ns0:tcW ns0:w="2242" ns0:type="dxa"/>
-            <ns0:gridSpan ns0:val="5"/>
-            <ns0:tcBorders>
-              <ns0:top ns0:val="nil"/>
-              <ns0:left ns0:val="dotted" ns0:sz="4" ns0:space="0" ns0:color="auto"/>
-              <ns0:bottom ns0:val="nil"/>
-              <ns0:right ns0:val="dotted" ns0:sz="4" ns0:space="0" ns0:color="auto"/>
-            </ns0:tcBorders>
-            <ns0:vAlign ns0:val="center"/>
-          </ns0:tcPr>
-          <ns0:p ns0:rsidR="00EA4E64" ns0:rsidRPr="00A212FE" ns0:rsidRDefault="00EA4E64" ns0:rsidP="00EA4E64">
-            <ns0:pPr>
-              <ns0:autoSpaceDE ns0:val="0"/>
-              <ns0:autoSpaceDN ns0:val="0"/>
-              <ns0:adjustRightInd ns0:val="0"/>
-              <ns0:jc ns0:val="center"/>
-              <ns0:rPr>
-                <ns0:rFonts ns0:ascii="Times New Roman" ns0:eastAsia="宋体" ns0:hAnsi="Times New Roman"/>
-                <ns0:color ns0:val="000000"/>
-                <ns0:sz ns0:val="18"/>
-                <ns0:szCs ns0:val="18"/>
-              </ns0:rPr>
-            </ns0:pPr>
-          </ns0:p>
-        </ns0:tc>
-        <ns0:tc>
-          <ns0:tcPr>
-            <ns0:tcW ns0:w="1008" ns0:type="dxa"/>
-            <ns0:gridSpan ns0:val="2"/>
-            <ns0:tcBorders>
-              <ns0:top ns0:val="nil"/>
-              <ns0:left ns0:val="dotted" ns0:sz="4" ns0:space="0" ns0:color="auto"/>
-              <ns0:bottom ns0:val="nil"/>
-              <ns0:right ns0:val="dotted" ns0:sz="4" ns0:space="0" ns0:color="auto"/>
-            </ns0:tcBorders>
-            <ns0:vAlign ns0:val="center"/>
-          </ns0:tcPr>
-          <ns0:p ns0:rsidR="00EA4E64" ns0:rsidRPr="00A212FE" ns0:rsidRDefault="00EA4E64" ns0:rsidP="00EA4E64">
-            <ns0:pPr>
-              <ns0:autoSpaceDE ns0:val="0"/>
-              <ns0:autoSpaceDN ns0:val="0"/>
-              <ns0:adjustRightInd ns0:val="0"/>
-              <ns0:jc ns0:val="center"/>
-              <ns0:rPr>
-                <ns0:rFonts ns0:ascii="Times New Roman" ns0:eastAsia="宋体" ns0:hAnsi="Times New Roman"/>
-                <ns0:color ns0:val="000000"/>
-                <ns0:sz ns0:val="18"/>
-                <ns0:szCs ns0:val="18"/>
-              </ns0:rPr>
-            </ns0:pPr>
-          </ns0:p>
-        </ns0:tc>
-      </ns0:tr>
-      <ns0:tr ns0:rsidR="000D4836" ns0:rsidTr="00042401">
-        <ns0:trPr>
-          <ns0:trHeight ns0:val="567"/>
-          <ns0:jc ns0:val="center"/>
-        </ns0:trPr>
-        <ns0:tc>
-          <ns0:tcPr>
-            <ns0:tcW ns0:w="1115" ns0:type="dxa"/>
-            <ns0:gridSpan ns0:val="2"/>
-            <ns0:tcBorders>
-              <ns0:top ns0:val="nil"/>
-              <ns0:left ns0:val="dotted" ns0:sz="4" ns0:space="0" ns0:color="auto"/>
-              <ns0:bottom ns0:val="nil"/>
-              <ns0:right ns0:val="dotted" ns0:sz="4" ns0:space="0" ns0:color="auto"/>
-            </ns0:tcBorders>
-            <ns0:vAlign ns0:val="center"/>
-          </ns0:tcPr>
-          <ns0:p ns0:rsidR="000D4836" ns0:rsidRPr="00A212FE" ns0:rsidRDefault="000D4836" ns0:rsidP="00EA4E64">
-            <ns0:pPr>
-              <ns0:autoSpaceDE ns0:val="0"/>
-              <ns0:autoSpaceDN ns0:val="0"/>
-              <ns0:adjustRightInd ns0:val="0"/>
-              <ns0:jc ns0:val="center"/>
-              <ns0:rPr>
-                <ns0:rFonts ns0:ascii="Times New Roman" ns0:eastAsia="宋体" ns0:hAnsi="Times New Roman"/>
-                <ns0:color ns0:val="000000"/>
-                <ns0:sz ns0:val="18"/>
-                <ns0:szCs ns0:val="18"/>
-              </ns0:rPr>
-            </ns0:pPr>
-          </ns0:p>
-        </ns0:tc>
-        <ns0:tc>
-          <ns0:tcPr>
-            <ns0:tcW ns0:w="1119" ns0:type="dxa"/>
-            <ns0:gridSpan ns0:val="2"/>
-            <ns0:tcBorders>
-              <ns0:top ns0:val="nil"/>
-              <ns0:left ns0:val="dotted" ns0:sz="4" ns0:space="0" ns0:color="auto"/>
-              <ns0:bottom ns0:val="nil"/>
-              <ns0:right ns0:val="dotted" ns0:sz="4" ns0:space="0" ns0:color="auto"/>
-            </ns0:tcBorders>
-            <ns0:vAlign ns0:val="center"/>
-          </ns0:tcPr>
-          <ns0:p ns0:rsidR="000D4836" ns0:rsidRPr="00A212FE" ns0:rsidRDefault="000D4836" ns0:rsidP="00EA4E64">
-            <ns0:pPr>
-              <ns0:autoSpaceDE ns0:val="0"/>
-              <ns0:autoSpaceDN ns0:val="0"/>
-              <ns0:adjustRightInd ns0:val="0"/>
-              <ns0:jc ns0:val="center"/>
-              <ns0:rPr>
-                <ns0:rFonts ns0:ascii="Times New Roman" ns0:eastAsia="宋体" ns0:hAnsi="Times New Roman"/>
-                <ns0:color ns0:val="000000"/>
-                <ns0:sz ns0:val="18"/>
-                <ns0:szCs ns0:val="18"/>
-              </ns0:rPr>
-            </ns0:pPr>
-          </ns0:p>
-        </ns0:tc>
-        <ns0:tc>
-          <ns0:tcPr>
-            <ns0:tcW ns0:w="1027" ns0:type="dxa"/>
-            <ns0:gridSpan ns0:val="2"/>
-            <ns0:tcBorders>
-              <ns0:top ns0:val="nil"/>
-              <ns0:left ns0:val="dotted" ns0:sz="4" ns0:space="0" ns0:color="auto"/>
-              <ns0:bottom ns0:val="nil"/>
-              <ns0:right ns0:val="dotted" ns0:sz="4" ns0:space="0" ns0:color="auto"/>
-            </ns0:tcBorders>
-            <ns0:vAlign ns0:val="center"/>
-          </ns0:tcPr>
-          <ns0:p ns0:rsidR="000D4836" ns0:rsidRPr="00A212FE" ns0:rsidRDefault="000D4836" ns0:rsidP="00EA4E64">
-            <ns0:pPr>
-              <ns0:autoSpaceDE ns0:val="0"/>
-              <ns0:autoSpaceDN ns0:val="0"/>
-              <ns0:adjustRightInd ns0:val="0"/>
-              <ns0:jc ns0:val="center"/>
-              <ns0:rPr>
-                <ns0:rFonts ns0:ascii="Times New Roman" ns0:eastAsia="宋体" ns0:hAnsi="Times New Roman"/>
-                <ns0:color ns0:val="000000"/>
-                <ns0:sz ns0:val="18"/>
-                <ns0:szCs ns0:val="18"/>
-              </ns0:rPr>
-            </ns0:pPr>
-          </ns0:p>
-        </ns0:tc>
-        <ns0:tc>
-          <ns0:tcPr>
-            <ns0:tcW ns0:w="1912" ns0:type="dxa"/>
-            <ns0:gridSpan ns0:val="4"/>
-            <ns0:tcBorders>
-              <ns0:top ns0:val="nil"/>
-              <ns0:left ns0:val="dotted" ns0:sz="4" ns0:space="0" ns0:color="auto"/>
-              <ns0:bottom ns0:val="nil"/>
-              <ns0:right ns0:val="dotted" ns0:sz="4" ns0:space="0" ns0:color="auto"/>
-            </ns0:tcBorders>
-            <ns0:vAlign ns0:val="center"/>
-          </ns0:tcPr>
-          <ns0:p ns0:rsidR="000D4836" ns0:rsidRPr="00D27ACA" ns0:rsidRDefault="000D4836" ns0:rsidP="00EA4E64">
-            <ns0:pPr>
-              <ns0:autoSpaceDE ns0:val="0"/>
-              <ns0:autoSpaceDN ns0:val="0"/>
-              <ns0:adjustRightInd ns0:val="0"/>
-              <ns0:jc ns0:val="center"/>
-              <ns0:rPr>
-                <ns0:rFonts ns0:ascii="Times New Roman" ns0:eastAsia="宋体" ns0:hAnsi="Times New Roman"/>
-                <ns0:color ns0:val="000000"/>
-                <ns0:sz ns0:val="18"/>
-                <ns0:szCs ns0:val="18"/>
-              </ns0:rPr>
-            </ns0:pPr>
-          </ns0:p>
-        </ns0:tc>
-        <ns0:tc>
-          <ns0:tcPr>
-            <ns0:tcW ns0:w="2237" ns0:type="dxa"/>
-            <ns0:gridSpan ns0:val="4"/>
-            <ns0:tcBorders>
-              <ns0:top ns0:val="nil"/>
-              <ns0:left ns0:val="dotted" ns0:sz="4" ns0:space="0" ns0:color="auto"/>
-              <ns0:bottom ns0:val="nil"/>
-              <ns0:right ns0:val="dotted" ns0:sz="4" ns0:space="0" ns0:color="auto"/>
-            </ns0:tcBorders>
-            <ns0:vAlign ns0:val="center"/>
-          </ns0:tcPr>
-          <ns0:p ns0:rsidR="000D4836" ns0:rsidRPr="00D27ACA" ns0:rsidRDefault="000D4836" ns0:rsidP="00EA4E64">
-            <ns0:pPr>
-              <ns0:autoSpaceDE ns0:val="0"/>
-              <ns0:autoSpaceDN ns0:val="0"/>
-              <ns0:adjustRightInd ns0:val="0"/>
-              <ns0:jc ns0:val="center"/>
-              <ns0:rPr>
-                <ns0:rFonts ns0:ascii="Times New Roman" ns0:eastAsia="宋体" ns0:hAnsi="Times New Roman"/>
-                <ns0:color ns0:val="000000"/>
-                <ns0:sz ns0:val="18"/>
-                <ns0:szCs ns0:val="18"/>
-              </ns0:rPr>
-            </ns0:pPr>
-          </ns0:p>
-        </ns0:tc>
-        <ns0:tc>
-          <ns0:tcPr>
-            <ns0:tcW ns0:w="2242" ns0:type="dxa"/>
-            <ns0:gridSpan ns0:val="5"/>
-            <ns0:tcBorders>
-              <ns0:top ns0:val="nil"/>
-              <ns0:left ns0:val="dotted" ns0:sz="4" ns0:space="0" ns0:color="auto"/>
-              <ns0:bottom ns0:val="nil"/>
-              <ns0:right ns0:val="dotted" ns0:sz="4" ns0:space="0" ns0:color="auto"/>
-            </ns0:tcBorders>
-            <ns0:vAlign ns0:val="center"/>
-          </ns0:tcPr>
-          <ns0:p ns0:rsidR="000D4836" ns0:rsidRPr="00A212FE" ns0:rsidRDefault="000D4836" ns0:rsidP="00EA4E64">
-            <ns0:pPr>
-              <ns0:autoSpaceDE ns0:val="0"/>
-              <ns0:autoSpaceDN ns0:val="0"/>
-              <ns0:adjustRightInd ns0:val="0"/>
-              <ns0:jc ns0:val="center"/>
-              <ns0:rPr>
-                <ns0:rFonts ns0:ascii="Times New Roman" ns0:eastAsia="宋体" ns0:hAnsi="Times New Roman"/>
-                <ns0:color ns0:val="000000"/>
-                <ns0:sz ns0:val="18"/>
-                <ns0:szCs ns0:val="18"/>
-              </ns0:rPr>
-            </ns0:pPr>
-          </ns0:p>
-        </ns0:tc>
-        <ns0:tc>
-          <ns0:tcPr>
-            <ns0:tcW ns0:w="1008" ns0:type="dxa"/>
-            <ns0:gridSpan ns0:val="2"/>
-            <ns0:tcBorders>
-              <ns0:top ns0:val="nil"/>
-              <ns0:left ns0:val="dotted" ns0:sz="4" ns0:space="0" ns0:color="auto"/>
-              <ns0:bottom ns0:val="nil"/>
-              <ns0:right ns0:val="dotted" ns0:sz="4" ns0:space="0" ns0:color="auto"/>
-            </ns0:tcBorders>
-            <ns0:vAlign ns0:val="center"/>
-          </ns0:tcPr>
-          <ns0:p ns0:rsidR="000D4836" ns0:rsidRPr="00A212FE" ns0:rsidRDefault="000D4836" ns0:rsidP="00EA4E64">
-            <ns0:pPr>
-              <ns0:autoSpaceDE ns0:val="0"/>
-              <ns0:autoSpaceDN ns0:val="0"/>
-              <ns0:adjustRightInd ns0:val="0"/>
-              <ns0:jc ns0:val="center"/>
-              <ns0:rPr>
-                <ns0:rFonts ns0:ascii="Times New Roman" ns0:eastAsia="宋体" ns0:hAnsi="Times New Roman"/>
-                <ns0:color ns0:val="000000"/>
-                <ns0:sz ns0:val="18"/>
-                <ns0:szCs ns0:val="18"/>
-              </ns0:rPr>
-            </ns0:pPr>
+              <ns0:t/>
+            </ns0:r>
           </ns0:p>
         </ns0:tc>
       </ns0:tr>
@@ -7299,65 +5944,10 @@
               <ns0:bottom ns0:val="nil"/>
             </ns0:tcBorders>
           </ns0:tcPr>
-          <ns0:p ns0:rsidR="002D1973" ns0:rsidRDefault="002D1973" ns0:rsidP="00003013">
-            <ns0:pPr>
-              <ns0:autoSpaceDE ns0:val="0"/>
-              <ns0:autoSpaceDN ns0:val="0"/>
-              <ns0:adjustRightInd ns0:val="0"/>
-              <ns0:rPr>
-                <ns0:rFonts ns0:ascii="宋体" ns0:eastAsia="宋体" ns0:hAnsi="Times New Roman" ns0:cs="宋体"/>
-                <ns0:sz ns0:val="24"/>
-                <ns0:szCs ns0:val="24"/>
-                <ns0:lang ns0:val="zh-CN"/>
-              </ns0:rPr>
-            </ns0:pPr>
-            <ns0:r>
-              <ns0:rPr>
-                <ns0:rFonts ns0:ascii="Times New Roman" ns0:eastAsia="宋体" ns0:hAnsi="Times New Roman" ns0:hint="eastAsia"/>
-                <ns0:color ns0:val="000000"/>
-                <ns0:sz ns0:val="24"/>
-                <ns0:szCs ns0:val="24"/>
-              </ns0:rPr>
+          <ns0:p>
+            <ns0:r>
               <ns0:t>温度：</ns0:t>
-            </ns0:r>
-            <ns0:r ns0:rsidR="00345F9F">
-              <ns0:rPr>
-                <ns0:rFonts ns0:ascii="Times New Roman" ns0:eastAsia="宋体" ns0:hAnsi="Times New Roman"/>
-                <ns0:color ns0:val="000000"/>
-                <ns0:sz ns0:val="24"/>
-                <ns0:szCs ns0:val="24"/>
-              </ns0:rPr>
-              <ns0:t>18</ns0:t>
-            </ns0:r>
-            <ns0:r>
-              <ns0:rPr>
-                <ns0:rFonts ns0:ascii="宋体" ns0:eastAsia="宋体" ns0:hAnsi="Times New Roman" ns0:cs="宋体" ns0:hint="eastAsia"/>
-                <ns0:sz ns0:val="24"/>
-                <ns0:szCs ns0:val="24"/>
-                <ns0:lang ns0:val="zh-CN"/>
-              </ns0:rPr>
-              <ns0:t>℃</ns0:t>
-            </ns0:r>
-          </ns0:p>
-          <ns0:p ns0:rsidR="002D1973" ns0:rsidRPr="002D1973" ns0:rsidRDefault="002D1973" ns0:rsidP="00003013">
-            <ns0:pPr>
-              <ns0:autoSpaceDE ns0:val="0"/>
-              <ns0:autoSpaceDN ns0:val="0"/>
-              <ns0:adjustRightInd ns0:val="0"/>
-              <ns0:rPr>
-                <ns0:rFonts ns0:ascii="Times New Roman" ns0:eastAsia="宋体" ns0:hAnsi="Times New Roman"/>
-                <ns0:color ns0:val="000000"/>
-                <ns0:sz ns0:val="15"/>
-                <ns0:szCs ns0:val="15"/>
-              </ns0:rPr>
-            </ns0:pPr>
-            <ns0:r ns0:rsidRPr="002D1973">
-              <ns0:rPr>
-                <ns0:rFonts ns0:ascii="Times New Roman" ns0:eastAsia="宋体" ns0:hAnsi="Times New Roman"/>
-                <ns0:sz ns0:val="15"/>
-                <ns0:szCs ns0:val="15"/>
-                <ns0:lang ns0:val="zh-CN"/>
-              </ns0:rPr>
+              <ns0:br/>
               <ns0:t>Ambient temperature</ns0:t>
             </ns0:r>
           </ns0:p>
@@ -7370,65 +5960,10 @@
               <ns0:bottom ns0:val="nil"/>
             </ns0:tcBorders>
           </ns0:tcPr>
-          <ns0:p ns0:rsidR="002D1973" ns0:rsidRDefault="002D1973" ns0:rsidP="00003013">
-            <ns0:pPr>
-              <ns0:autoSpaceDE ns0:val="0"/>
-              <ns0:autoSpaceDN ns0:val="0"/>
-              <ns0:adjustRightInd ns0:val="0"/>
-              <ns0:rPr>
-                <ns0:rFonts ns0:ascii="宋体" ns0:eastAsia="宋体" ns0:hAnsi="Times New Roman" ns0:cs="宋体"/>
-                <ns0:sz ns0:val="24"/>
-                <ns0:szCs ns0:val="24"/>
-                <ns0:lang ns0:val="zh-CN"/>
-              </ns0:rPr>
-            </ns0:pPr>
-            <ns0:r>
-              <ns0:rPr>
-                <ns0:rFonts ns0:ascii="Times New Roman" ns0:eastAsia="宋体" ns0:hAnsi="Times New Roman" ns0:hint="eastAsia"/>
-                <ns0:color ns0:val="000000"/>
-                <ns0:sz ns0:val="24"/>
-                <ns0:szCs ns0:val="24"/>
-              </ns0:rPr>
+          <ns0:p>
+            <ns0:r>
               <ns0:t>湿度：</ns0:t>
-            </ns0:r>
-            <ns0:r ns0:rsidR="000D4836">
-              <ns0:rPr>
-                <ns0:rFonts ns0:ascii="Times New Roman" ns0:eastAsia="宋体" ns0:hAnsi="Times New Roman"/>
-                <ns0:sz ns0:val="24"/>
-                <ns0:szCs ns0:val="24"/>
-                <ns0:lang ns0:val="zh-CN"/>
-              </ns0:rPr>
-              <ns0:t>5</ns0:t>
-            </ns0:r>
-            <ns0:r ns0:rsidRPr="002D1973">
-              <ns0:rPr>
-                <ns0:rFonts ns0:ascii="Times New Roman" ns0:eastAsia="宋体" ns0:hAnsi="Times New Roman"/>
-                <ns0:sz ns0:val="24"/>
-                <ns0:szCs ns0:val="24"/>
-                <ns0:lang ns0:val="zh-CN"/>
-              </ns0:rPr>
-              <ns0:t>0%RH</ns0:t>
-            </ns0:r>
-          </ns0:p>
-          <ns0:p ns0:rsidR="002D1973" ns0:rsidRDefault="002D1973" ns0:rsidP="00003013">
-            <ns0:pPr>
-              <ns0:autoSpaceDE ns0:val="0"/>
-              <ns0:autoSpaceDN ns0:val="0"/>
-              <ns0:adjustRightInd ns0:val="0"/>
-              <ns0:rPr>
-                <ns0:rFonts ns0:ascii="宋体" ns0:eastAsia="宋体" ns0:hAnsi="Times New Roman" ns0:cs="宋体"/>
-                <ns0:sz ns0:val="24"/>
-                <ns0:szCs ns0:val="24"/>
-                <ns0:lang ns0:val="zh-CN"/>
-              </ns0:rPr>
-            </ns0:pPr>
-            <ns0:r ns0:rsidRPr="002D1973">
-              <ns0:rPr>
-                <ns0:rFonts ns0:ascii="Times New Roman" ns0:eastAsia="宋体" ns0:hAnsi="Times New Roman"/>
-                <ns0:sz ns0:val="15"/>
-                <ns0:szCs ns0:val="15"/>
-                <ns0:lang ns0:val="zh-CN"/>
-              </ns0:rPr>
+              <ns0:br/>
               <ns0:t>Relative humidity</ns0:t>
             </ns0:r>
           </ns0:p>
@@ -7441,65 +5976,10 @@
               <ns0:bottom ns0:val="nil"/>
             </ns0:tcBorders>
           </ns0:tcPr>
-          <ns0:p ns0:rsidR="002D1973" ns0:rsidRDefault="009C6D62" ns0:rsidP="00003013">
-            <ns0:pPr>
-              <ns0:autoSpaceDE ns0:val="0"/>
-              <ns0:autoSpaceDN ns0:val="0"/>
-              <ns0:adjustRightInd ns0:val="0"/>
-              <ns0:rPr>
-                <ns0:rFonts ns0:ascii="Times New Roman" ns0:eastAsia="宋体" ns0:hAnsi="Times New Roman"/>
-                <ns0:color ns0:val="000000"/>
-                <ns0:sz ns0:val="15"/>
-                <ns0:szCs ns0:val="15"/>
-              </ns0:rPr>
-            </ns0:pPr>
-            <ns0:r>
-              <ns0:rPr>
-                <ns0:rFonts ns0:ascii="Times New Roman" ns0:eastAsia="宋体" ns0:hAnsi="Times New Roman" ns0:hint="eastAsia"/>
-                <ns0:color ns0:val="000000"/>
-                <ns0:sz ns0:val="24"/>
-                <ns0:szCs ns0:val="24"/>
-              </ns0:rPr>
-              <ns0:t>其它</ns0:t>
-            </ns0:r>
-            <ns0:r ns0:rsidR="002D1973" ns0:rsidRPr="002D1973">
-              <ns0:rPr>
-                <ns0:rFonts ns0:ascii="Times New Roman" ns0:eastAsia="宋体" ns0:hAnsi="Times New Roman"/>
-                <ns0:color ns0:val="000000"/>
-                <ns0:sz ns0:val="24"/>
-                <ns0:szCs ns0:val="24"/>
-              </ns0:rPr>
-              <ns0:t>：</ns0:t>
-            </ns0:r>
-            <ns0:r ns0:rsidR="002D1973" ns0:rsidRPr="002D1973">
-              <ns0:rPr>
-                <ns0:rFonts ns0:ascii="Times New Roman" ns0:eastAsia="宋体" ns0:hAnsi="Times New Roman" ns0:hint="eastAsia"/>
-                <ns0:color ns0:val="000000"/>
-                <ns0:sz ns0:val="24"/>
-                <ns0:szCs ns0:val="24"/>
-              </ns0:rPr>
-              <ns0:t xml:space="preserve"> /</ns0:t>
-            </ns0:r>
-          </ns0:p>
-          <ns0:p ns0:rsidR="002D1973" ns0:rsidRPr="002D1973" ns0:rsidRDefault="002D1973" ns0:rsidP="00003013">
-            <ns0:pPr>
-              <ns0:autoSpaceDE ns0:val="0"/>
-              <ns0:autoSpaceDN ns0:val="0"/>
-              <ns0:adjustRightInd ns0:val="0"/>
-              <ns0:rPr>
-                <ns0:rFonts ns0:ascii="Times New Roman" ns0:eastAsia="宋体" ns0:hAnsi="Times New Roman"/>
-                <ns0:color ns0:val="000000"/>
-                <ns0:sz ns0:val="15"/>
-                <ns0:szCs ns0:val="15"/>
-              </ns0:rPr>
-            </ns0:pPr>
-            <ns0:r>
-              <ns0:rPr>
-                <ns0:rFonts ns0:ascii="Times New Roman" ns0:eastAsia="宋体" ns0:hAnsi="Times New Roman" ns0:hint="eastAsia"/>
-                <ns0:color ns0:val="000000"/>
-                <ns0:sz ns0:val="15"/>
-                <ns0:szCs ns0:val="15"/>
-              </ns0:rPr>
+          <ns0:p>
+            <ns0:r>
+              <ns0:t>其它：</ns0:t>
+              <ns0:br/>
               <ns0:t>Others</ns0:t>
             </ns0:r>
           </ns0:p>
@@ -7621,7 +6101,7 @@
                 <ns0:sz ns0:val="24"/>
                 <ns0:szCs ns0:val="24"/>
               </ns0:rPr>
-              <ns0:t>202</ns0:t>
+              <ns0:t> </ns0:t>
             </ns0:r>
             <ns0:r ns0:rsidR="000D4836">
               <ns0:rPr>
@@ -7630,7 +6110,7 @@
                 <ns0:sz ns0:val="24"/>
                 <ns0:szCs ns0:val="24"/>
               </ns0:rPr>
-              <ns0:t>6</ns0:t>
+              <ns0:t/>
             </ns0:r>
           </ns0:p>
         </ns0:tc>
@@ -7715,7 +6195,7 @@
                 <ns0:sz ns0:val="24"/>
                 <ns0:szCs ns0:val="24"/>
               </ns0:rPr>
-              <ns0:t>0</ns0:t>
+              <ns0:t> </ns0:t>
             </ns0:r>
             <ns0:r ns0:rsidR="00E70336">
               <ns0:rPr>
@@ -7724,7 +6204,7 @@
                 <ns0:sz ns0:val="24"/>
                 <ns0:szCs ns0:val="24"/>
               </ns0:rPr>
-              <ns0:t>3</ns0:t>
+              <ns0:t/>
             </ns0:r>
           </ns0:p>
         </ns0:tc>
@@ -7809,7 +6289,7 @@
                 <ns0:sz ns0:val="24"/>
                 <ns0:szCs ns0:val="24"/>
               </ns0:rPr>
-              <ns0:t>19</ns0:t>
+              <ns0:t> </ns0:t>
             </ns0:r>
           </ns0:p>
         </ns0:tc>
@@ -7936,7 +6416,7 @@
                 <ns0:sz ns0:val="24"/>
                 <ns0:szCs ns0:val="24"/>
               </ns0:rPr>
-              <ns0:t>202</ns0:t>
+              <ns0:t> </ns0:t>
             </ns0:r>
             <ns0:r ns0:rsidR="000D4836">
               <ns0:rPr>
@@ -7945,7 +6425,7 @@
                 <ns0:sz ns0:val="24"/>
                 <ns0:szCs ns0:val="24"/>
               </ns0:rPr>
-              <ns0:t>6</ns0:t>
+              <ns0:t/>
             </ns0:r>
           </ns0:p>
         </ns0:tc>
@@ -8030,7 +6510,7 @@
                 <ns0:sz ns0:val="24"/>
                 <ns0:szCs ns0:val="24"/>
               </ns0:rPr>
-              <ns0:t>0</ns0:t>
+              <ns0:t> </ns0:t>
             </ns0:r>
             <ns0:r ns0:rsidR="00E70336">
               <ns0:rPr>
@@ -8039,7 +6519,7 @@
                 <ns0:sz ns0:val="24"/>
                 <ns0:szCs ns0:val="24"/>
               </ns0:rPr>
-              <ns0:t>3</ns0:t>
+              <ns0:t/>
             </ns0:r>
           </ns0:p>
         </ns0:tc>
@@ -8125,7 +6605,7 @@
                 <ns0:sz ns0:val="24"/>
                 <ns0:szCs ns0:val="24"/>
               </ns0:rPr>
-              <ns0:t>19</ns0:t>
+              <ns0:t> </ns0:t>
             </ns0:r>
           </ns0:p>
         </ns0:tc>
@@ -9237,942 +7717,6 @@
                 <ns0:szCs ns0:val="18"/>
               </ns0:rPr>
             </ns0:pPr>
-          </ns0:p>
-        </ns0:tc>
-      </ns0:tr>
-      <ns0:tr ns0:rsidR="00144042" ns0:rsidTr="001974B2">
-        <ns0:trPr>
-          <ns0:trHeight ns0:val="567"/>
-          <ns0:jc ns0:val="center"/>
-        </ns0:trPr>
-        <ns0:tc>
-          <ns0:tcPr>
-            <ns0:tcW ns0:w="661" ns0:type="dxa"/>
-            <ns0:tcBorders>
-              <ns0:top ns0:val="nil"/>
-            </ns0:tcBorders>
-          </ns0:tcPr>
-          <ns0:p ns0:rsidR="00144042" ns0:rsidRPr="00EA5AE6" ns0:rsidRDefault="00144042" ns0:rsidP="001974B2">
-            <ns0:pPr>
-              <ns0:autoSpaceDE ns0:val="0"/>
-              <ns0:autoSpaceDN ns0:val="0"/>
-              <ns0:adjustRightInd ns0:val="0"/>
-              <ns0:rPr>
-                <ns0:rFonts ns0:ascii="宋体" ns0:eastAsia="宋体" ns0:hAnsi="Times New Roman" ns0:cs="宋体"/>
-                <ns0:sz ns0:val="24"/>
-                <ns0:szCs ns0:val="24"/>
-              </ns0:rPr>
-            </ns0:pPr>
-          </ns0:p>
-        </ns0:tc>
-        <ns0:tc>
-          <ns0:tcPr>
-            <ns0:tcW ns0:w="661" ns0:type="dxa"/>
-            <ns0:tcBorders>
-              <ns0:top ns0:val="nil"/>
-            </ns0:tcBorders>
-          </ns0:tcPr>
-          <ns0:p ns0:rsidR="00144042" ns0:rsidRPr="00B1070E" ns0:rsidRDefault="00144042" ns0:rsidP="001974B2">
-            <ns0:pPr>
-              <ns0:autoSpaceDE ns0:val="0"/>
-              <ns0:autoSpaceDN ns0:val="0"/>
-              <ns0:adjustRightInd ns0:val="0"/>
-              <ns0:rPr>
-                <ns0:rFonts ns0:ascii="Times New Roman" ns0:eastAsia="宋体" ns0:hAnsi="Times New Roman"/>
-                <ns0:color ns0:val="000000"/>
-                <ns0:sz ns0:val="24"/>
-                <ns0:szCs ns0:val="24"/>
-              </ns0:rPr>
-            </ns0:pPr>
-            <ns0:r ns0:rsidRPr="00B1070E">
-              <ns0:rPr>
-                <ns0:rFonts ns0:ascii="Times New Roman" ns0:eastAsia="宋体" ns0:hAnsi="Times New Roman"/>
-                <ns0:color ns0:val="000000"/>
-                <ns0:sz ns0:val="24"/>
-                <ns0:szCs ns0:val="24"/>
-                <ns0:lang ns0:val="zh-CN"/>
-              </ns0:rPr>
-              <ns0:t>一</ns0:t>
-            </ns0:r>
-            <ns0:r ns0:rsidRPr="00B1070E">
-              <ns0:rPr>
-                <ns0:rFonts ns0:ascii="Times New Roman" ns0:eastAsia="宋体" ns0:hAnsi="Times New Roman"/>
-                <ns0:color ns0:val="000000"/>
-                <ns0:szCs ns0:val="21"/>
-                <ns0:lang ns0:val="zh-CN"/>
-              </ns0:rPr>
-              <ns0:t>、</ns0:t>
-            </ns0:r>
-          </ns0:p>
-        </ns0:tc>
-        <ns0:tc>
-          <ns0:tcPr>
-            <ns0:tcW ns0:w="9338" ns0:type="dxa"/>
-            <ns0:tcBorders>
-              <ns0:top ns0:val="nil"/>
-            </ns0:tcBorders>
-          </ns0:tcPr>
-          <ns0:p ns0:rsidR="00144042" ns0:rsidRPr="00B1070E" ns0:rsidRDefault="00144042" ns0:rsidP="001974B2">
-            <ns0:pPr>
-              <ns0:autoSpaceDE ns0:val="0"/>
-              <ns0:autoSpaceDN ns0:val="0"/>
-              <ns0:adjustRightInd ns0:val="0"/>
-              <ns0:rPr>
-                <ns0:rFonts ns0:ascii="Times New Roman" ns0:eastAsia="宋体" ns0:hAnsi="Times New Roman"/>
-                <ns0:color ns0:val="000000"/>
-                <ns0:sz ns0:val="24"/>
-                <ns0:szCs ns0:val="24"/>
-              </ns0:rPr>
-            </ns0:pPr>
-            <ns0:r ns0:rsidRPr="00B1070E">
-              <ns0:rPr>
-                <ns0:rFonts ns0:ascii="Times New Roman" ns0:eastAsia="宋体" ns0:hAnsi="Times New Roman"/>
-                <ns0:sz ns0:val="24"/>
-                <ns0:szCs ns0:val="24"/>
-              </ns0:rPr>
-              <ns0:t>一般检查</ns0:t>
-            </ns0:r>
-            <ns0:r ns0:rsidR="00B241C6">
-              <ns0:rPr>
-                <ns0:rFonts ns0:ascii="宋体" ns0:eastAsia="宋体" ns0:hAnsi="Times New Roman" ns0:cs="宋体" ns0:hint="eastAsia"/>
-                <ns0:sz ns0:val="24"/>
-                <ns0:szCs ns0:val="24"/>
-              </ns0:rPr>
-              <ns0:t>（*）</ns0:t>
-            </ns0:r>
-            <ns0:r ns0:rsidRPr="00B1070E">
-              <ns0:rPr>
-                <ns0:rFonts ns0:ascii="Times New Roman" ns0:eastAsia="宋体" ns0:hAnsi="Times New Roman"/>
-                <ns0:sz ns0:val="24"/>
-                <ns0:szCs ns0:val="24"/>
-              </ns0:rPr>
-              <ns0:t>：</ns0:t>
-            </ns0:r>
-            <ns0:r ns0:rsidRPr="00B1070E">
-              <ns0:rPr>
-                <ns0:rFonts ns0:ascii="Times New Roman" ns0:eastAsia="宋体" ns0:hAnsi="Times New Roman"/>
-                <ns0:color ns0:val="000000"/>
-                <ns0:sz ns0:val="24"/>
-                <ns0:szCs ns0:val="24"/>
-              </ns0:rPr>
-              <ns0:t xml:space="preserve"> </ns0:t>
-            </ns0:r>
-          </ns0:p>
-        </ns0:tc>
-      </ns0:tr>
-      <ns0:tr ns0:rsidR="00345F9F" ns0:rsidTr="00D80F0B">
-        <ns0:trPr>
-          <ns0:trHeight ns0:val="567"/>
-          <ns0:jc ns0:val="center"/>
-        </ns0:trPr>
-        <ns0:tc>
-          <ns0:tcPr>
-            <ns0:tcW ns0:w="661" ns0:type="dxa"/>
-          </ns0:tcPr>
-          <ns0:p ns0:rsidR="00345F9F" ns0:rsidRPr="009945B6" ns0:rsidRDefault="00345F9F" ns0:rsidP="00345F9F">
-            <ns0:pPr>
-              <ns0:autoSpaceDE ns0:val="0"/>
-              <ns0:autoSpaceDN ns0:val="0"/>
-              <ns0:adjustRightInd ns0:val="0"/>
-              <ns0:rPr>
-                <ns0:rFonts ns0:ascii="宋体" ns0:eastAsia="宋体" ns0:hAnsi="Times New Roman" ns0:cs="宋体"/>
-                <ns0:sz ns0:val="24"/>
-                <ns0:szCs ns0:val="24"/>
-              </ns0:rPr>
-            </ns0:pPr>
-          </ns0:p>
-        </ns0:tc>
-        <ns0:tc>
-          <ns0:tcPr>
-            <ns0:tcW ns0:w="661" ns0:type="dxa"/>
-          </ns0:tcPr>
-          <ns0:p ns0:rsidR="00345F9F" ns0:rsidRPr="00EA4E64" ns0:rsidRDefault="00345F9F" ns0:rsidP="00345F9F">
-            <ns0:pPr>
-              <ns0:autoSpaceDE ns0:val="0"/>
-              <ns0:autoSpaceDN ns0:val="0"/>
-              <ns0:adjustRightInd ns0:val="0"/>
-              <ns0:jc ns0:val="right"/>
-              <ns0:rPr>
-                <ns0:rFonts ns0:ascii="Times New Roman" ns0:hAnsi="Times New Roman"/>
-                <ns0:sz ns0:val="24"/>
-                <ns0:szCs ns0:val="24"/>
-              </ns0:rPr>
-            </ns0:pPr>
-            <ns0:r>
-              <ns0:rPr>
-                <ns0:rFonts ns0:ascii="Times New Roman" ns0:hAnsi="Times New Roman" ns0:hint="eastAsia"/>
-                <ns0:sz ns0:val="24"/>
-                <ns0:szCs ns0:val="24"/>
-                <ns0:lang ns0:val="zh-CN"/>
-              </ns0:rPr>
-              <ns0:t>(1)</ns0:t>
-            </ns0:r>
-            <ns0:r ns0:rsidRPr="00EA4E64">
-              <ns0:rPr>
-                <ns0:rFonts ns0:ascii="Times New Roman" ns0:hAnsi="Times New Roman"/>
-                <ns0:sz ns0:val="24"/>
-                <ns0:szCs ns0:val="24"/>
-                <ns0:lang ns0:val="zh-CN"/>
-              </ns0:rPr>
-              <ns0:t xml:space="preserve">　</ns0:t>
-            </ns0:r>
-          </ns0:p>
-        </ns0:tc>
-        <ns0:tc>
-          <ns0:tcPr>
-            <ns0:tcW ns0:w="9338" ns0:type="dxa"/>
-            <ns0:tcBorders>
-              <ns0:bottom ns0:val="nil"/>
-            </ns0:tcBorders>
-          </ns0:tcPr>
-          <ns0:p ns0:rsidR="00345F9F" ns0:rsidRPr="00A81D9F" ns0:rsidRDefault="00A81D9F" ns0:rsidP="00A81D9F">
-            <ns0:pPr>
-              <ns0:autoSpaceDE ns0:val="0"/>
-              <ns0:autoSpaceDN ns0:val="0"/>
-              <ns0:adjustRightInd ns0:val="0"/>
-              <ns0:spacing ns0:line="360" ns0:lineRule="auto"/>
-              <ns0:rPr>
-                <ns0:rFonts ns0:ascii="Times New Roman" ns0:eastAsia="宋体" ns0:hAnsi="Times New Roman"/>
-                <ns0:sz ns0:val="24"/>
-                <ns0:szCs ns0:val="24"/>
-              </ns0:rPr>
-            </ns0:pPr>
-            <ns0:r>
-              <ns0:rPr>
-                <ns0:rFonts ns0:ascii="Times New Roman" ns0:eastAsia="宋体" ns0:hAnsi="Times New Roman" ns0:hint="eastAsia"/>
-                <ns0:sz ns0:val="24"/>
-                <ns0:szCs ns0:val="24"/>
-              </ns0:rPr>
-              <ns0:t>旋转夹头能绕试件轴线双向旋转，旋转夹头转速均匀稳定。</ns0:t>
-            </ns0:r>
-          </ns0:p>
-        </ns0:tc>
-      </ns0:tr>
-      <ns0:tr ns0:rsidR="00345F9F" ns0:rsidTr="00D80F0B">
-        <ns0:trPr>
-          <ns0:trHeight ns0:val="567"/>
-          <ns0:jc ns0:val="center"/>
-        </ns0:trPr>
-        <ns0:tc>
-          <ns0:tcPr>
-            <ns0:tcW ns0:w="661" ns0:type="dxa"/>
-          </ns0:tcPr>
-          <ns0:p ns0:rsidR="00345F9F" ns0:rsidRPr="009945B6" ns0:rsidRDefault="00345F9F" ns0:rsidP="00345F9F">
-            <ns0:pPr>
-              <ns0:autoSpaceDE ns0:val="0"/>
-              <ns0:autoSpaceDN ns0:val="0"/>
-              <ns0:adjustRightInd ns0:val="0"/>
-              <ns0:rPr>
-                <ns0:rFonts ns0:ascii="宋体" ns0:eastAsia="宋体" ns0:hAnsi="Times New Roman" ns0:cs="宋体"/>
-                <ns0:sz ns0:val="24"/>
-                <ns0:szCs ns0:val="24"/>
-              </ns0:rPr>
-            </ns0:pPr>
-          </ns0:p>
-        </ns0:tc>
-        <ns0:tc>
-          <ns0:tcPr>
-            <ns0:tcW ns0:w="661" ns0:type="dxa"/>
-          </ns0:tcPr>
-          <ns0:p ns0:rsidR="00345F9F" ns0:rsidRPr="00EA4E64" ns0:rsidRDefault="00345F9F" ns0:rsidP="00345F9F">
-            <ns0:pPr>
-              <ns0:autoSpaceDE ns0:val="0"/>
-              <ns0:autoSpaceDN ns0:val="0"/>
-              <ns0:adjustRightInd ns0:val="0"/>
-              <ns0:jc ns0:val="right"/>
-              <ns0:rPr>
-                <ns0:rFonts ns0:ascii="Times New Roman" ns0:hAnsi="Times New Roman"/>
-                <ns0:sz ns0:val="24"/>
-                <ns0:szCs ns0:val="24"/>
-              </ns0:rPr>
-            </ns0:pPr>
-            <ns0:r>
-              <ns0:rPr>
-                <ns0:rFonts ns0:ascii="Times New Roman" ns0:hAnsi="Times New Roman" ns0:hint="eastAsia"/>
-                <ns0:sz ns0:val="24"/>
-                <ns0:szCs ns0:val="24"/>
-                <ns0:lang ns0:val="zh-CN"/>
-              </ns0:rPr>
-              <ns0:t>(2)</ns0:t>
-            </ns0:r>
-            <ns0:r ns0:rsidRPr="00EA4E64">
-              <ns0:rPr>
-                <ns0:rFonts ns0:ascii="Times New Roman" ns0:hAnsi="Times New Roman"/>
-                <ns0:sz ns0:val="24"/>
-                <ns0:szCs ns0:val="24"/>
-                <ns0:lang ns0:val="zh-CN"/>
-              </ns0:rPr>
-              <ns0:t xml:space="preserve">　</ns0:t>
-            </ns0:r>
-          </ns0:p>
-        </ns0:tc>
-        <ns0:tc>
-          <ns0:tcPr>
-            <ns0:tcW ns0:w="9338" ns0:type="dxa"/>
-            <ns0:tcBorders>
-              <ns0:bottom ns0:val="nil"/>
-            </ns0:tcBorders>
-          </ns0:tcPr>
-          <ns0:p ns0:rsidR="00A81D9F" ns0:rsidRDefault="00A81D9F" ns0:rsidP="00A81D9F">
-            <ns0:pPr>
-              <ns0:autoSpaceDE ns0:val="0"/>
-              <ns0:autoSpaceDN ns0:val="0"/>
-              <ns0:adjustRightInd ns0:val="0"/>
-              <ns0:spacing ns0:line="360" ns0:lineRule="auto"/>
-              <ns0:rPr>
-                <ns0:rFonts ns0:ascii="Times New Roman" ns0:eastAsia="宋体" ns0:hAnsi="Times New Roman"/>
-                <ns0:sz ns0:val="24"/>
-                <ns0:szCs ns0:val="24"/>
-              </ns0:rPr>
-            </ns0:pPr>
-            <ns0:r>
-              <ns0:rPr>
-                <ns0:rFonts ns0:ascii="Times New Roman" ns0:eastAsia="宋体" ns0:hAnsi="Times New Roman" ns0:hint="eastAsia"/>
-                <ns0:sz ns0:val="24"/>
-                <ns0:szCs ns0:val="24"/>
-              </ns0:rPr>
-              <ns0:t>定位夹头能沿轴向移动调节两夹头间的距离，定位夹头上能施加一定负荷，</ns0:t>
-            </ns0:r>
-          </ns0:p>
-          <ns0:p ns0:rsidR="00345F9F" ns0:rsidRPr="00A81D9F" ns0:rsidRDefault="00A81D9F" ns0:rsidP="00A81D9F">
-            <ns0:pPr>
-              <ns0:autoSpaceDE ns0:val="0"/>
-              <ns0:autoSpaceDN ns0:val="0"/>
-              <ns0:adjustRightInd ns0:val="0"/>
-              <ns0:spacing ns0:line="360" ns0:lineRule="auto"/>
-              <ns0:rPr>
-                <ns0:rFonts ns0:ascii="Times New Roman" ns0:eastAsia="宋体" ns0:hAnsi="Times New Roman"/>
-                <ns0:sz ns0:val="24"/>
-                <ns0:szCs ns0:val="24"/>
-              </ns0:rPr>
-            </ns0:pPr>
-            <ns0:r>
-              <ns0:rPr>
-                <ns0:rFonts ns0:ascii="Times New Roman" ns0:eastAsia="宋体" ns0:hAnsi="Times New Roman" ns0:hint="eastAsia"/>
-                <ns0:sz ns0:val="24"/>
-                <ns0:szCs ns0:val="24"/>
-              </ns0:rPr>
-              <ns0:t>使扭转的试件处于平直状态。</ns0:t>
-            </ns0:r>
-          </ns0:p>
-        </ns0:tc>
-      </ns0:tr>
-      <ns0:tr ns0:rsidR="00345F9F" ns0:rsidTr="00D80F0B">
-        <ns0:trPr>
-          <ns0:trHeight ns0:val="567"/>
-          <ns0:jc ns0:val="center"/>
-        </ns0:trPr>
-        <ns0:tc>
-          <ns0:tcPr>
-            <ns0:tcW ns0:w="661" ns0:type="dxa"/>
-          </ns0:tcPr>
-          <ns0:p ns0:rsidR="00345F9F" ns0:rsidRPr="009945B6" ns0:rsidRDefault="00345F9F" ns0:rsidP="00345F9F">
-            <ns0:pPr>
-              <ns0:autoSpaceDE ns0:val="0"/>
-              <ns0:autoSpaceDN ns0:val="0"/>
-              <ns0:adjustRightInd ns0:val="0"/>
-              <ns0:rPr>
-                <ns0:rFonts ns0:ascii="宋体" ns0:eastAsia="宋体" ns0:hAnsi="Times New Roman" ns0:cs="宋体"/>
-                <ns0:sz ns0:val="24"/>
-                <ns0:szCs ns0:val="24"/>
-              </ns0:rPr>
-            </ns0:pPr>
-          </ns0:p>
-        </ns0:tc>
-        <ns0:tc>
-          <ns0:tcPr>
-            <ns0:tcW ns0:w="661" ns0:type="dxa"/>
-          </ns0:tcPr>
-          <ns0:p ns0:rsidR="00345F9F" ns0:rsidRPr="00EA4E64" ns0:rsidRDefault="00345F9F" ns0:rsidP="00345F9F">
-            <ns0:pPr>
-              <ns0:autoSpaceDE ns0:val="0"/>
-              <ns0:autoSpaceDN ns0:val="0"/>
-              <ns0:adjustRightInd ns0:val="0"/>
-              <ns0:jc ns0:val="right"/>
-              <ns0:rPr>
-                <ns0:rFonts ns0:ascii="Times New Roman" ns0:hAnsi="Times New Roman"/>
-                <ns0:sz ns0:val="24"/>
-                <ns0:szCs ns0:val="24"/>
-              </ns0:rPr>
-            </ns0:pPr>
-            <ns0:r>
-              <ns0:rPr>
-                <ns0:rFonts ns0:ascii="Times New Roman" ns0:hAnsi="Times New Roman" ns0:hint="eastAsia"/>
-                <ns0:sz ns0:val="24"/>
-                <ns0:szCs ns0:val="24"/>
-                <ns0:lang ns0:val="zh-CN"/>
-              </ns0:rPr>
-              <ns0:t>(3)</ns0:t>
-            </ns0:r>
-            <ns0:r ns0:rsidRPr="00EA4E64">
-              <ns0:rPr>
-                <ns0:rFonts ns0:ascii="Times New Roman" ns0:hAnsi="Times New Roman"/>
-                <ns0:sz ns0:val="24"/>
-                <ns0:szCs ns0:val="24"/>
-                <ns0:lang ns0:val="zh-CN"/>
-              </ns0:rPr>
-              <ns0:t xml:space="preserve">　</ns0:t>
-            </ns0:r>
-          </ns0:p>
-        </ns0:tc>
-        <ns0:tc>
-          <ns0:tcPr>
-            <ns0:tcW ns0:w="9338" ns0:type="dxa"/>
-            <ns0:tcBorders>
-              <ns0:bottom ns0:val="nil"/>
-            </ns0:tcBorders>
-          </ns0:tcPr>
-          <ns0:p ns0:rsidR="00345F9F" ns0:rsidRPr="00A81D9F" ns0:rsidRDefault="00A81D9F" ns0:rsidP="00A81D9F">
-            <ns0:pPr>
-              <ns0:autoSpaceDE ns0:val="0"/>
-              <ns0:autoSpaceDN ns0:val="0"/>
-              <ns0:adjustRightInd ns0:val="0"/>
-              <ns0:spacing ns0:line="360" ns0:lineRule="auto"/>
-              <ns0:rPr>
-                <ns0:rFonts ns0:ascii="Times New Roman" ns0:eastAsia="宋体" ns0:hAnsi="Times New Roman"/>
-                <ns0:sz ns0:val="24"/>
-                <ns0:szCs ns0:val="24"/>
-              </ns0:rPr>
-            </ns0:pPr>
-            <ns0:r>
-              <ns0:rPr>
-                <ns0:rFonts ns0:ascii="Times New Roman" ns0:eastAsia="宋体" ns0:hAnsi="Times New Roman" ns0:hint="eastAsia"/>
-                <ns0:sz ns0:val="24"/>
-                <ns0:szCs ns0:val="24"/>
-              </ns0:rPr>
-              <ns0:t>夹具能夹紧试样，两夹头间最大起始距离：</ns0:t>
-            </ns0:r>
-            <ns0:r>
-              <ns0:rPr>
-                <ns0:rFonts ns0:ascii="Times New Roman" ns0:eastAsia="宋体" ns0:hAnsi="Times New Roman"/>
-                <ns0:sz ns0:val="24"/>
-                <ns0:szCs ns0:val="24"/>
-              </ns0:rPr>
-              <ns0:t>500mm</ns0:t>
-            </ns0:r>
-            <ns0:r>
-              <ns0:rPr>
-                <ns0:rFonts ns0:ascii="Times New Roman" ns0:eastAsia="宋体" ns0:hAnsi="Times New Roman" ns0:hint="eastAsia"/>
-                <ns0:sz ns0:val="24"/>
-                <ns0:szCs ns0:val="24"/>
-              </ns0:rPr>
-              <ns0:t>。</ns0:t>
-            </ns0:r>
-          </ns0:p>
-        </ns0:tc>
-      </ns0:tr>
-      <ns0:tr ns0:rsidR="00345F9F" ns0:rsidTr="00D80F0B">
-        <ns0:trPr>
-          <ns0:trHeight ns0:val="567"/>
-          <ns0:jc ns0:val="center"/>
-        </ns0:trPr>
-        <ns0:tc>
-          <ns0:tcPr>
-            <ns0:tcW ns0:w="661" ns0:type="dxa"/>
-          </ns0:tcPr>
-          <ns0:p ns0:rsidR="00345F9F" ns0:rsidRPr="009945B6" ns0:rsidRDefault="00345F9F" ns0:rsidP="00345F9F">
-            <ns0:pPr>
-              <ns0:autoSpaceDE ns0:val="0"/>
-              <ns0:autoSpaceDN ns0:val="0"/>
-              <ns0:adjustRightInd ns0:val="0"/>
-              <ns0:rPr>
-                <ns0:rFonts ns0:ascii="宋体" ns0:eastAsia="宋体" ns0:hAnsi="Times New Roman" ns0:cs="宋体"/>
-                <ns0:sz ns0:val="24"/>
-                <ns0:szCs ns0:val="24"/>
-              </ns0:rPr>
-            </ns0:pPr>
-          </ns0:p>
-        </ns0:tc>
-        <ns0:tc>
-          <ns0:tcPr>
-            <ns0:tcW ns0:w="661" ns0:type="dxa"/>
-          </ns0:tcPr>
-          <ns0:p ns0:rsidR="00345F9F" ns0:rsidRDefault="00345F9F" ns0:rsidP="00345F9F">
-            <ns0:pPr>
-              <ns0:autoSpaceDE ns0:val="0"/>
-              <ns0:autoSpaceDN ns0:val="0"/>
-              <ns0:adjustRightInd ns0:val="0"/>
-              <ns0:jc ns0:val="right"/>
-              <ns0:rPr>
-                <ns0:rFonts ns0:ascii="Times New Roman" ns0:hAnsi="Times New Roman"/>
-                <ns0:sz ns0:val="24"/>
-                <ns0:szCs ns0:val="24"/>
-                <ns0:lang ns0:val="zh-CN"/>
-              </ns0:rPr>
-            </ns0:pPr>
-            <ns0:r>
-              <ns0:rPr>
-                <ns0:rFonts ns0:ascii="Times New Roman" ns0:hAnsi="Times New Roman" ns0:hint="eastAsia"/>
-                <ns0:sz ns0:val="24"/>
-                <ns0:szCs ns0:val="24"/>
-                <ns0:lang ns0:val="zh-CN"/>
-              </ns0:rPr>
-              <ns0:t>(</ns0:t>
-            </ns0:r>
-            <ns0:r>
-              <ns0:rPr>
-                <ns0:rFonts ns0:ascii="Times New Roman" ns0:hAnsi="Times New Roman"/>
-                <ns0:sz ns0:val="24"/>
-                <ns0:szCs ns0:val="24"/>
-                <ns0:lang ns0:val="zh-CN"/>
-              </ns0:rPr>
-              <ns0:t>4</ns0:t>
-            </ns0:r>
-            <ns0:r>
-              <ns0:rPr>
-                <ns0:rFonts ns0:ascii="Times New Roman" ns0:hAnsi="Times New Roman" ns0:hint="eastAsia"/>
-                <ns0:sz ns0:val="24"/>
-                <ns0:szCs ns0:val="24"/>
-                <ns0:lang ns0:val="zh-CN"/>
-              </ns0:rPr>
-              <ns0:t>)</ns0:t>
-            </ns0:r>
-          </ns0:p>
-        </ns0:tc>
-        <ns0:tc>
-          <ns0:tcPr>
-            <ns0:tcW ns0:w="9338" ns0:type="dxa"/>
-            <ns0:tcBorders>
-              <ns0:bottom ns0:val="nil"/>
-            </ns0:tcBorders>
-          </ns0:tcPr>
-          <ns0:p ns0:rsidR="00345F9F" ns0:rsidRPr="009C656A" ns0:rsidRDefault="009C656A" ns0:rsidP="009C656A">
-            <ns0:pPr>
-              <ns0:autoSpaceDE ns0:val="0"/>
-              <ns0:autoSpaceDN ns0:val="0"/>
-              <ns0:adjustRightInd ns0:val="0"/>
-              <ns0:spacing ns0:line="360" ns0:lineRule="auto"/>
-              <ns0:rPr>
-                <ns0:rFonts ns0:ascii="Times New Roman" ns0:eastAsia="宋体" ns0:hAnsi="Times New Roman"/>
-                <ns0:sz ns0:val="24"/>
-                <ns0:szCs ns0:val="24"/>
-              </ns0:rPr>
-            </ns0:pPr>
-            <ns0:r>
-              <ns0:rPr>
-                <ns0:rFonts ns0:ascii="Times New Roman" ns0:eastAsia="宋体" ns0:hAnsi="Times New Roman" ns0:hint="eastAsia"/>
-                <ns0:sz ns0:val="24"/>
-                <ns0:szCs ns0:val="24"/>
-              </ns0:rPr>
-              <ns0:t>抛光绕棒有足够的刚度。</ns0:t>
-            </ns0:r>
-          </ns0:p>
-        </ns0:tc>
-      </ns0:tr>
-      <ns0:tr ns0:rsidR="00345F9F" ns0:rsidTr="00D80F0B">
-        <ns0:trPr>
-          <ns0:trHeight ns0:val="567"/>
-          <ns0:jc ns0:val="center"/>
-        </ns0:trPr>
-        <ns0:tc>
-          <ns0:tcPr>
-            <ns0:tcW ns0:w="661" ns0:type="dxa"/>
-          </ns0:tcPr>
-          <ns0:p ns0:rsidR="00345F9F" ns0:rsidRPr="009945B6" ns0:rsidRDefault="00345F9F" ns0:rsidP="00345F9F">
-            <ns0:pPr>
-              <ns0:autoSpaceDE ns0:val="0"/>
-              <ns0:autoSpaceDN ns0:val="0"/>
-              <ns0:adjustRightInd ns0:val="0"/>
-              <ns0:rPr>
-                <ns0:rFonts ns0:ascii="宋体" ns0:eastAsia="宋体" ns0:hAnsi="Times New Roman" ns0:cs="宋体"/>
-                <ns0:sz ns0:val="24"/>
-                <ns0:szCs ns0:val="24"/>
-              </ns0:rPr>
-            </ns0:pPr>
-          </ns0:p>
-        </ns0:tc>
-        <ns0:tc>
-          <ns0:tcPr>
-            <ns0:tcW ns0:w="661" ns0:type="dxa"/>
-          </ns0:tcPr>
-          <ns0:p ns0:rsidR="00345F9F" ns0:rsidRDefault="00345F9F" ns0:rsidP="00345F9F">
-            <ns0:pPr>
-              <ns0:autoSpaceDE ns0:val="0"/>
-              <ns0:autoSpaceDN ns0:val="0"/>
-              <ns0:adjustRightInd ns0:val="0"/>
-              <ns0:jc ns0:val="right"/>
-              <ns0:rPr>
-                <ns0:rFonts ns0:ascii="Times New Roman" ns0:hAnsi="Times New Roman"/>
-                <ns0:sz ns0:val="24"/>
-                <ns0:szCs ns0:val="24"/>
-                <ns0:lang ns0:val="zh-CN"/>
-              </ns0:rPr>
-            </ns0:pPr>
-            <ns0:r>
-              <ns0:rPr>
-                <ns0:rFonts ns0:ascii="Times New Roman" ns0:hAnsi="Times New Roman" ns0:hint="eastAsia"/>
-                <ns0:sz ns0:val="24"/>
-                <ns0:szCs ns0:val="24"/>
-                <ns0:lang ns0:val="zh-CN"/>
-              </ns0:rPr>
-              <ns0:t>(</ns0:t>
-            </ns0:r>
-            <ns0:r>
-              <ns0:rPr>
-                <ns0:rFonts ns0:ascii="Times New Roman" ns0:hAnsi="Times New Roman"/>
-                <ns0:sz ns0:val="24"/>
-                <ns0:szCs ns0:val="24"/>
-                <ns0:lang ns0:val="zh-CN"/>
-              </ns0:rPr>
-              <ns0:t>5</ns0:t>
-            </ns0:r>
-            <ns0:r>
-              <ns0:rPr>
-                <ns0:rFonts ns0:ascii="Times New Roman" ns0:hAnsi="Times New Roman" ns0:hint="eastAsia"/>
-                <ns0:sz ns0:val="24"/>
-                <ns0:szCs ns0:val="24"/>
-                <ns0:lang ns0:val="zh-CN"/>
-              </ns0:rPr>
-              <ns0:t>)</ns0:t>
-            </ns0:r>
-          </ns0:p>
-        </ns0:tc>
-        <ns0:tc>
-          <ns0:tcPr>
-            <ns0:tcW ns0:w="9338" ns0:type="dxa"/>
-            <ns0:tcBorders>
-              <ns0:bottom ns0:val="nil"/>
-            </ns0:tcBorders>
-          </ns0:tcPr>
-          <ns0:p ns0:rsidR="00345F9F" ns0:rsidRPr="00345F9F" ns0:rsidRDefault="009C656A" ns0:rsidP="00345F9F">
-            <ns0:pPr>
-              <ns0:autoSpaceDE ns0:val="0"/>
-              <ns0:autoSpaceDN ns0:val="0"/>
-              <ns0:adjustRightInd ns0:val="0"/>
-              <ns0:rPr>
-                <ns0:rFonts ns0:ascii="Times New Roman" ns0:eastAsia="宋体" ns0:hAnsi="Times New Roman"/>
-                <ns0:color ns0:val="000000"/>
-                <ns0:sz ns0:val="24"/>
-                <ns0:szCs ns0:val="24"/>
-                <ns0:lang ns0:val="zh-CN"/>
-              </ns0:rPr>
-            </ns0:pPr>
-            <ns0:r>
-              <ns0:rPr>
-                <ns0:rFonts ns0:ascii="Times New Roman" ns0:eastAsia="宋体" ns0:hAnsi="Times New Roman" ns0:hint="eastAsia"/>
-                <ns0:sz ns0:val="24"/>
-                <ns0:szCs ns0:val="24"/>
-              </ns0:rPr>
-              <ns0:t>负荷、</ns0:t>
-            </ns0:r>
-            <ns0:r ns0:rsidR="00345F9F" ns0:rsidRPr="00F551E8">
-              <ns0:rPr>
-                <ns0:rFonts ns0:ascii="宋体" ns0:eastAsia="宋体" ns0:hAnsi="Times New Roman" ns0:cs="宋体" ns0:hint="eastAsia"/>
-                <ns0:color ns0:val="000000"/>
-                <ns0:sz ns0:val="24"/>
-                <ns0:szCs ns0:val="24"/>
-                <ns0:lang ns0:val="zh-CN"/>
-              </ns0:rPr>
-              <ns0:t>齐全，能满足试验要求。</ns0:t>
-            </ns0:r>
-          </ns0:p>
-        </ns0:tc>
-      </ns0:tr>
-      <ns0:tr ns0:rsidR="003C3A8E" ns0:rsidTr="00D80F0B">
-        <ns0:trPr>
-          <ns0:trHeight ns0:val="567"/>
-          <ns0:jc ns0:val="center"/>
-        </ns0:trPr>
-        <ns0:tc>
-          <ns0:tcPr>
-            <ns0:tcW ns0:w="661" ns0:type="dxa"/>
-          </ns0:tcPr>
-          <ns0:p ns0:rsidR="003C3A8E" ns0:rsidRPr="009945B6" ns0:rsidRDefault="003C3A8E" ns0:rsidP="003C3A8E">
-            <ns0:pPr>
-              <ns0:autoSpaceDE ns0:val="0"/>
-              <ns0:autoSpaceDN ns0:val="0"/>
-              <ns0:adjustRightInd ns0:val="0"/>
-              <ns0:rPr>
-                <ns0:rFonts ns0:ascii="宋体" ns0:eastAsia="宋体" ns0:hAnsi="Times New Roman" ns0:cs="宋体"/>
-                <ns0:sz ns0:val="24"/>
-                <ns0:szCs ns0:val="24"/>
-              </ns0:rPr>
-            </ns0:pPr>
-          </ns0:p>
-        </ns0:tc>
-        <ns0:tc>
-          <ns0:tcPr>
-            <ns0:tcW ns0:w="661" ns0:type="dxa"/>
-          </ns0:tcPr>
-          <ns0:p ns0:rsidR="003C3A8E" ns0:rsidRPr="003C3A8E" ns0:rsidRDefault="003C3A8E" ns0:rsidP="003C3A8E">
-            <ns0:pPr>
-              <ns0:autoSpaceDE ns0:val="0"/>
-              <ns0:autoSpaceDN ns0:val="0"/>
-              <ns0:adjustRightInd ns0:val="0"/>
-              <ns0:rPr>
-                <ns0:rFonts ns0:ascii="Times New Roman" ns0:eastAsia="宋体" ns0:hAnsi="Times New Roman"/>
-                <ns0:color ns0:val="000000"/>
-                <ns0:sz ns0:val="24"/>
-                <ns0:szCs ns0:val="24"/>
-              </ns0:rPr>
-            </ns0:pPr>
-            <ns0:r>
-              <ns0:rPr>
-                <ns0:rFonts ns0:ascii="Times New Roman" ns0:eastAsia="宋体" ns0:hAnsi="Times New Roman" ns0:hint="eastAsia"/>
-                <ns0:color ns0:val="000000"/>
-                <ns0:sz ns0:val="24"/>
-                <ns0:szCs ns0:val="24"/>
-                <ns0:lang ns0:val="zh-CN"/>
-              </ns0:rPr>
-              <ns0:t>二</ns0:t>
-            </ns0:r>
-            <ns0:r ns0:rsidRPr="003C3A8E">
-              <ns0:rPr>
-                <ns0:rFonts ns0:ascii="Times New Roman" ns0:eastAsia="宋体" ns0:hAnsi="Times New Roman"/>
-                <ns0:color ns0:val="000000"/>
-                <ns0:sz ns0:val="24"/>
-                <ns0:szCs ns0:val="24"/>
-                <ns0:lang ns0:val="zh-CN"/>
-              </ns0:rPr>
-              <ns0:t>、</ns0:t>
-            </ns0:r>
-          </ns0:p>
-        </ns0:tc>
-        <ns0:tc>
-          <ns0:tcPr>
-            <ns0:tcW ns0:w="9338" ns0:type="dxa"/>
-            <ns0:tcBorders>
-              <ns0:bottom ns0:val="nil"/>
-            </ns0:tcBorders>
-          </ns0:tcPr>
-          <ns0:p ns0:rsidR="003C3A8E" ns0:rsidRPr="003C3A8E" ns0:rsidRDefault="003C3A8E" ns0:rsidP="003C3A8E">
-            <ns0:pPr>
-              <ns0:autoSpaceDE ns0:val="0"/>
-              <ns0:autoSpaceDN ns0:val="0"/>
-              <ns0:adjustRightInd ns0:val="0"/>
-              <ns0:rPr>
-                <ns0:rFonts ns0:ascii="Times New Roman" ns0:eastAsia="宋体" ns0:hAnsi="Times New Roman"/>
-                <ns0:color ns0:val="000000"/>
-                <ns0:sz ns0:val="24"/>
-                <ns0:szCs ns0:val="24"/>
-              </ns0:rPr>
-            </ns0:pPr>
-            <ns0:r ns0:rsidRPr="003C3A8E">
-              <ns0:rPr>
-                <ns0:rFonts ns0:ascii="Times New Roman" ns0:eastAsia="宋体" ns0:hAnsi="Times New Roman"/>
-                <ns0:color ns0:val="000000"/>
-                <ns0:sz ns0:val="24"/>
-                <ns0:szCs ns0:val="24"/>
-                <ns0:lang ns0:val="zh-CN"/>
-              </ns0:rPr>
-              <ns0:t>卷绕速度校准：</ns0:t>
-            </ns0:r>
-            <ns0:r ns0:rsidRPr="003C3A8E">
-              <ns0:rPr>
-                <ns0:rFonts ns0:ascii="Times New Roman" ns0:eastAsia="宋体" ns0:hAnsi="Times New Roman"/>
-                <ns0:i/>
-                <ns0:color ns0:val="000000"/>
-                <ns0:sz ns0:val="24"/>
-                <ns0:szCs ns0:val="24"/>
-                <ns0:lang ns0:val="zh-CN"/>
-              </ns0:rPr>
-              <ns0:t>U</ns0:t>
-            </ns0:r>
-            <ns0:r ns0:rsidR="00345F9F">
-              <ns0:rPr>
-                <ns0:rFonts ns0:ascii="Times New Roman" ns0:eastAsia="宋体" ns0:hAnsi="Times New Roman"/>
-                <ns0:color ns0:val="000000"/>
-                <ns0:sz ns0:val="24"/>
-                <ns0:szCs ns0:val="24"/>
-                <ns0:lang ns0:val="zh-CN"/>
-              </ns0:rPr>
-              <ns0:t>=0.2</ns0:t>
-            </ns0:r>
-            <ns0:r ns0:rsidR="00892A36">
-              <ns0:rPr>
-                <ns0:rFonts ns0:ascii="Times New Roman" ns0:eastAsia="宋体" ns0:hAnsi="Times New Roman"/>
-                <ns0:color ns0:val="000000"/>
-                <ns0:sz ns0:val="24"/>
-                <ns0:szCs ns0:val="24"/>
-                <ns0:lang ns0:val="zh-CN"/>
-              </ns0:rPr>
-              <ns0:t>r/min</ns0:t>
-            </ns0:r>
-            <ns0:r ns0:rsidRPr="003C3A8E">
-              <ns0:rPr>
-                <ns0:rFonts ns0:ascii="Times New Roman" ns0:hAnsi="Times New Roman"/>
-                <ns0:sz ns0:val="24"/>
-                <ns0:szCs ns0:val="24"/>
-              </ns0:rPr>
-              <ns0:t>,</ns0:t>
-            </ns0:r>
-            <ns0:r ns0:rsidRPr="003C3A8E">
-              <ns0:rPr>
-                <ns0:rFonts ns0:ascii="Times New Roman" ns0:hAnsi="Times New Roman"/>
-                <ns0:i/>
-                <ns0:sz ns0:val="24"/>
-                <ns0:szCs ns0:val="24"/>
-              </ns0:rPr>
-              <ns0:t>k</ns0:t>
-            </ns0:r>
-            <ns0:r ns0:rsidRPr="003C3A8E">
-              <ns0:rPr>
-                <ns0:rFonts ns0:ascii="Times New Roman" ns0:hAnsi="Times New Roman"/>
-                <ns0:sz ns0:val="24"/>
-                <ns0:szCs ns0:val="24"/>
-              </ns0:rPr>
-              <ns0:t>=2</ns0:t>
-            </ns0:r>
-            <ns0:r ns0:rsidRPr="003C3A8E">
-              <ns0:rPr>
-                <ns0:rFonts ns0:ascii="Times New Roman" ns0:eastAsia="宋体" ns0:hAnsi="Times New Roman"/>
-                <ns0:color ns0:val="000000"/>
-                <ns0:sz ns0:val="24"/>
-                <ns0:szCs ns0:val="24"/>
-                <ns0:lang ns0:val="zh-CN"/>
-              </ns0:rPr>
-              <ns0:t xml:space="preserve"> </ns0:t>
-            </ns0:r>
-          </ns0:p>
-        </ns0:tc>
-      </ns0:tr>
-      <ns0:tr ns0:rsidR="00C435FF" ns0:rsidTr="001974B2">
-        <ns0:trPr>
-          <ns0:trHeight ns0:val="567"/>
-          <ns0:jc ns0:val="center"/>
-        </ns0:trPr>
-        <ns0:tc>
-          <ns0:tcPr>
-            <ns0:tcW ns0:w="661" ns0:type="dxa"/>
-          </ns0:tcPr>
-          <ns0:p ns0:rsidR="00C435FF" ns0:rsidRPr="004072B8" ns0:rsidRDefault="00C435FF" ns0:rsidP="00C435FF">
-            <ns0:pPr>
-              <ns0:autoSpaceDE ns0:val="0"/>
-              <ns0:autoSpaceDN ns0:val="0"/>
-              <ns0:adjustRightInd ns0:val="0"/>
-              <ns0:rPr>
-                <ns0:rFonts ns0:ascii="宋体" ns0:eastAsia="宋体" ns0:hAnsi="宋体" ns0:cs="宋体"/>
-                <ns0:sz ns0:val="24"/>
-                <ns0:szCs ns0:val="24"/>
-                <ns0:lang ns0:val="zh-CN"/>
-              </ns0:rPr>
-            </ns0:pPr>
-          </ns0:p>
-        </ns0:tc>
-        <ns0:tc>
-          <ns0:tcPr>
-            <ns0:tcW ns0:w="661" ns0:type="dxa"/>
-          </ns0:tcPr>
-          <ns0:p ns0:rsidR="00C435FF" ns0:rsidRPr="00550270" ns0:rsidRDefault="00C435FF" ns0:rsidP="00C435FF">
-            <ns0:pPr>
-              <ns0:autoSpaceDE ns0:val="0"/>
-              <ns0:autoSpaceDN ns0:val="0"/>
-              <ns0:adjustRightInd ns0:val="0"/>
-              <ns0:rPr>
-                <ns0:rFonts ns0:ascii="Times New Roman" ns0:hAnsi="Times New Roman"/>
-                <ns0:sz ns0:val="24"/>
-                <ns0:szCs ns0:val="24"/>
-              </ns0:rPr>
-            </ns0:pPr>
-          </ns0:p>
-        </ns0:tc>
-        <ns0:tc>
-          <ns0:tcPr>
-            <ns0:tcW ns0:w="9338" ns0:type="dxa"/>
-            <ns0:tcBorders>
-              <ns0:bottom ns0:val="nil"/>
-            </ns0:tcBorders>
-          </ns0:tcPr>
-          <ns0:p ns0:rsidR="00C435FF" ns0:rsidRPr="00550270" ns0:rsidRDefault="00345F9F" ns0:rsidP="00892A36">
-            <ns0:pPr>
-              <ns0:autoSpaceDE ns0:val="0"/>
-              <ns0:autoSpaceDN ns0:val="0"/>
-              <ns0:adjustRightInd ns0:val="0"/>
-              <ns0:rPr>
-                <ns0:rFonts ns0:ascii="Times New Roman" ns0:hAnsi="Times New Roman"/>
-                <ns0:color ns0:val="000000"/>
-                <ns0:sz ns0:val="24"/>
-                <ns0:szCs ns0:val="24"/>
-                <ns0:lang ns0:val="zh-CN"/>
-              </ns0:rPr>
-            </ns0:pPr>
-            <ns0:r ns0:rsidRPr="003C3A8E">
-              <ns0:rPr>
-                <ns0:rFonts ns0:ascii="Times New Roman" ns0:eastAsia="宋体" ns0:hAnsi="Times New Roman"/>
-                <ns0:color ns0:val="000000"/>
-                <ns0:sz ns0:val="24"/>
-                <ns0:szCs ns0:val="24"/>
-                <ns0:lang ns0:val="zh-CN"/>
-              </ns0:rPr>
-              <ns0:t>卷绕速度</ns0:t>
-            </ns0:r>
-            <ns0:r>
-              <ns0:rPr>
-                <ns0:rFonts ns0:ascii="Times New Roman" ns0:eastAsia="宋体" ns0:hAnsi="Times New Roman" ns0:hint="eastAsia"/>
-                <ns0:color ns0:val="000000"/>
-                <ns0:sz ns0:val="24"/>
-                <ns0:szCs ns0:val="24"/>
-                <ns0:lang ns0:val="zh-CN"/>
-              </ns0:rPr>
-              <ns0:t>：</ns0:t>
-            </ns0:r>
-            <ns0:r ns0:rsidR="00892A36">
-              <ns0:rPr>
-                <ns0:rFonts ns0:ascii="Times New Roman" ns0:eastAsia="宋体" ns0:hAnsi="Times New Roman"/>
-                <ns0:color ns0:val="000000"/>
-                <ns0:sz ns0:val="24"/>
-                <ns0:szCs ns0:val="24"/>
-              </ns0:rPr>
-              <ns0:t>10</ns0:t>
-            </ns0:r>
-            <ns0:r ns0:rsidRPr="00F551E8">
-              <ns0:rPr>
-                <ns0:rFonts ns0:ascii="宋体" ns0:eastAsia="宋体" ns0:hAnsi="Times New Roman" ns0:cs="宋体" ns0:hint="eastAsia"/>
-                <ns0:color ns0:val="000000"/>
-                <ns0:sz ns0:val="24"/>
-                <ns0:szCs ns0:val="24"/>
-                <ns0:lang ns0:val="zh-CN"/>
-              </ns0:rPr>
-              <ns0:t>圈</ns0:t>
-            </ns0:r>
-            <ns0:r ns0:rsidR="00892A36">
-              <ns0:rPr>
-                <ns0:rFonts ns0:ascii="宋体" ns0:eastAsia="宋体" ns0:hAnsi="Times New Roman" ns0:cs="宋体"/>
-                <ns0:color ns0:val="000000"/>
-                <ns0:sz ns0:val="24"/>
-                <ns0:szCs ns0:val="24"/>
-                <ns0:lang ns0:val="zh-CN"/>
-              </ns0:rPr>
-              <ns0:t>-</ns0:t>
-            </ns0:r>
-            <ns0:r ns0:rsidR="00892A36">
-              <ns0:rPr>
-                <ns0:rFonts ns0:ascii="Times New Roman" ns0:eastAsia="宋体" ns0:hAnsi="Times New Roman"/>
-                <ns0:color ns0:val="000000"/>
-                <ns0:sz ns0:val="24"/>
-                <ns0:szCs ns0:val="24"/>
-              </ns0:rPr>
-              <ns0:t>120</ns0:t>
-            </ns0:r>
-            <ns0:r ns0:rsidR="00892A36" ns0:rsidRPr="00F551E8">
-              <ns0:rPr>
-                <ns0:rFonts ns0:ascii="宋体" ns0:eastAsia="宋体" ns0:hAnsi="Times New Roman" ns0:cs="宋体" ns0:hint="eastAsia"/>
-                <ns0:color ns0:val="000000"/>
-                <ns0:sz ns0:val="24"/>
-                <ns0:szCs ns0:val="24"/>
-                <ns0:lang ns0:val="zh-CN"/>
-              </ns0:rPr>
-              <ns0:t>圈</ns0:t>
-            </ns0:r>
-            <ns0:r ns0:rsidR="00892A36" ns0:rsidRPr="00F551E8">
-              <ns0:rPr>
-                <ns0:rFonts ns0:ascii="Times New Roman" ns0:eastAsia="宋体" ns0:hAnsi="Times New Roman"/>
-                <ns0:color ns0:val="000000"/>
-                <ns0:sz ns0:val="24"/>
-                <ns0:szCs ns0:val="24"/>
-              </ns0:rPr>
-              <ns0:t>/</ns0:t>
-            </ns0:r>
-            <ns0:r ns0:rsidR="00892A36">
-              <ns0:rPr>
-                <ns0:rFonts ns0:ascii="宋体" ns0:eastAsia="宋体" ns0:hAnsi="Times New Roman" ns0:cs="宋体" ns0:hint="eastAsia"/>
-                <ns0:color ns0:val="000000"/>
-                <ns0:sz ns0:val="24"/>
-                <ns0:szCs ns0:val="24"/>
-                <ns0:lang ns0:val="zh-CN"/>
-              </ns0:rPr>
-              <ns0:t>分钟。</ns0:t>
-            </ns0:r>
           </ns0:p>
         </ns0:tc>
       </ns0:tr>

</xml_diff>